<commit_message>
Auto sync 20251007 193519
</commit_message>
<xml_diff>
--- a/Безопасность информационных систем и технологий/Ответы на вопросы 4.docx
+++ b/Безопасность информационных систем и технологий/Ответы на вопросы 4.docx
@@ -4,6 +4,564 @@
   <w:body>
     <w:p>
       <w:pPr>
+        <w:pStyle w:val="a3"/>
+        <w:numPr>
+          <w:ilvl w:val="0"/>
+          <w:numId w:val="13"/>
+        </w:numPr>
+        <w:ind w:left="0" w:firstLine="709"/>
+        <w:jc w:val="both"/>
+        <w:rPr>
+          <w:rFonts w:ascii="Times New Roman" w:hAnsi="Times New Roman" w:cs="Times New Roman"/>
+          <w:sz w:val="28"/>
+          <w:szCs w:val="28"/>
+        </w:rPr>
+      </w:pPr>
+      <w:r>
+        <w:rPr>
+          <w:rFonts w:ascii="Times New Roman" w:hAnsi="Times New Roman" w:cs="Times New Roman"/>
+          <w:sz w:val="28"/>
+          <w:szCs w:val="28"/>
+        </w:rPr>
+        <w:t>Современные криптосистемы для защиты компьютерной информации.</w:t>
+      </w:r>
+    </w:p>
+    <w:p>
+      <w:pPr>
+        <w:pStyle w:val="a3"/>
+        <w:ind w:left="0" w:firstLine="709"/>
+        <w:jc w:val="both"/>
+        <w:rPr>
+          <w:rFonts w:ascii="Times New Roman" w:hAnsi="Times New Roman" w:cs="Times New Roman"/>
+          <w:sz w:val="28"/>
+          <w:szCs w:val="28"/>
+        </w:rPr>
+      </w:pPr>
+      <w:r>
+        <w:rPr>
+          <w:rFonts w:ascii="Times New Roman" w:hAnsi="Times New Roman" w:cs="Times New Roman"/>
+          <w:sz w:val="28"/>
+          <w:szCs w:val="28"/>
+        </w:rPr>
+        <w:t>Современные криптосистемы для защиты компьютерной информации представляют собой комплекс технологий, нацеленных на обеспечение конфиденциальности, целостности и аутентичности данных. В их основе лежат алгоритмы шифрования — симметричные (например, AES) и асимметричные (RSA, ECC), а также криптографические протоколы, такие как TLS и IPsec, которые защищают интернет-трафик и соединения. Цифровые подписи играют ключевую роль в подтверждении подлинности документов и транзакций, что особенно важно для правовой и коммерческой безопасности в цифровом пространстве. В современных условиях все шире внедряются новые протоколы, учитывающие угрозы со стороны квантовых компьютеров, что требует обновления криптографической базы.</w:t>
+      </w:r>
+    </w:p>
+    <w:p>
+      <w:pPr>
+        <w:pStyle w:val="a3"/>
+        <w:ind w:left="0" w:firstLine="709"/>
+        <w:jc w:val="both"/>
+        <w:rPr>
+          <w:rFonts w:ascii="Times New Roman" w:hAnsi="Times New Roman" w:cs="Times New Roman"/>
+          <w:sz w:val="28"/>
+          <w:szCs w:val="28"/>
+        </w:rPr>
+      </w:pPr>
+      <w:r>
+        <w:rPr>
+          <w:rFonts w:ascii="Times New Roman" w:hAnsi="Times New Roman" w:cs="Times New Roman"/>
+          <w:sz w:val="28"/>
+          <w:szCs w:val="28"/>
+        </w:rPr>
+        <w:t>В последние годы выросла актуальность постквантовой криптографии — раздела, разрабатывающего алгоритмы, устойчивые к взлому с помощью квантовых вычислений. Этот тренд стал реакцией на развитие квантовых технологий, способных нарушить безопасность традиционных методов шифрования. Важно заранее переходить на новые стандарты, чтобы защитить накопленные данные от возможной расшифровки в будущем. Помимо этого, современные системы активно используют концепцию Zero Trust с принципами «не доверять никому по умолчанию» и продвинутые средства обнаружения и реагирования (EDR/XDR), которые с помощью искусственного интеллекта выявляют и предотвращают сложные кибератаки в режиме реального времени.</w:t>
+      </w:r>
+    </w:p>
+    <w:p>
+      <w:pPr>
+        <w:pStyle w:val="a3"/>
+        <w:ind w:left="0" w:firstLine="709"/>
+        <w:jc w:val="both"/>
+        <w:rPr>
+          <w:rFonts w:ascii="Times New Roman" w:hAnsi="Times New Roman" w:cs="Times New Roman"/>
+          <w:sz w:val="28"/>
+          <w:szCs w:val="28"/>
+        </w:rPr>
+      </w:pPr>
+      <w:r>
+        <w:rPr>
+          <w:rFonts w:ascii="Times New Roman" w:hAnsi="Times New Roman" w:cs="Times New Roman"/>
+          <w:sz w:val="28"/>
+          <w:szCs w:val="28"/>
+        </w:rPr>
+        <w:t>Комплексный подход к информационной безопасности требует не только совершенствования криптографических методов, но и внедрения дополнительных мер, таких как многофакторная аутентификация, строгие политики по управлению паролями, использование ИИ для мониторинга безопасности и оптимизация платформ для централизованного управления защитой. Органика конкуренции и развития технологий приводит к появлению новых решений, гармонично сочетающих производительность, устойчивость к современным угрозам и соответствие нормативным требованиям. Таким образом, современные криптосистемы являются неотъемлемой частью многоуровневой стратегии защиты информации в условиях развития киберугроз и технологической эволюции.</w:t>
+      </w:r>
+    </w:p>
+    <w:p>
+      <w:pPr>
+        <w:ind w:firstLine="709"/>
+        <w:jc w:val="both"/>
+        <w:rPr>
+          <w:rFonts w:ascii="Times New Roman" w:hAnsi="Times New Roman" w:cs="Times New Roman"/>
+          <w:sz w:val="28"/>
+          <w:szCs w:val="28"/>
+        </w:rPr>
+      </w:pPr>
+      <w:r>
+        <w:rPr>
+          <w:rFonts w:ascii="Times New Roman" w:hAnsi="Times New Roman" w:cs="Times New Roman"/>
+          <w:sz w:val="28"/>
+          <w:szCs w:val="28"/>
+        </w:rPr>
+        <w:t>2. Способы симметрического шифрования. Современные алгоритмы симметрического шифрования.</w:t>
+      </w:r>
+    </w:p>
+    <w:p>
+      <w:pPr>
+        <w:ind w:firstLine="709"/>
+        <w:jc w:val="both"/>
+        <w:rPr>
+          <w:rFonts w:ascii="Times New Roman" w:hAnsi="Times New Roman" w:cs="Times New Roman"/>
+          <w:sz w:val="28"/>
+          <w:szCs w:val="28"/>
+        </w:rPr>
+      </w:pPr>
+      <w:r>
+        <w:rPr>
+          <w:rFonts w:ascii="Times New Roman" w:hAnsi="Times New Roman" w:cs="Times New Roman"/>
+          <w:sz w:val="28"/>
+          <w:szCs w:val="28"/>
+        </w:rPr>
+        <w:t xml:space="preserve">Симметрическое шифрование — это метод защиты информации, при котором один и тот же ключ используется как для шифрования, так и для дешифрования данных. Этот подход основывается на разделении данных на блоки или потоковую обработку, в зависимости от типа алгоритма. Блочные </w:t>
+      </w:r>
+      <w:r>
+        <w:rPr>
+          <w:rFonts w:ascii="Times New Roman" w:hAnsi="Times New Roman" w:cs="Times New Roman"/>
+          <w:sz w:val="28"/>
+          <w:szCs w:val="28"/>
+        </w:rPr>
+        <w:lastRenderedPageBreak/>
+        <w:t>шифры преобразуют фиксированные блоки данных с помощью сложных многократных операций подстановок и перестановок, обеспечивая надежное и нелинейное преобразование исходной информации. Поточные шифры вместо этого работают с потоком данных и используют генерируемую псевдослучайную последовательность для побитового шифрования. Симметричные алгоритмы чаще всего выбирают за их высокую скорость и эффективность при обработке больших объемов информации.</w:t>
+      </w:r>
+    </w:p>
+    <w:p>
+      <w:pPr>
+        <w:ind w:firstLine="709"/>
+        <w:jc w:val="both"/>
+        <w:rPr>
+          <w:rFonts w:ascii="Times New Roman" w:hAnsi="Times New Roman" w:cs="Times New Roman"/>
+          <w:sz w:val="28"/>
+          <w:szCs w:val="28"/>
+        </w:rPr>
+      </w:pPr>
+      <w:r>
+        <w:rPr>
+          <w:rFonts w:ascii="Times New Roman" w:hAnsi="Times New Roman" w:cs="Times New Roman"/>
+          <w:sz w:val="28"/>
+          <w:szCs w:val="28"/>
+        </w:rPr>
+        <w:t>К современным алгоритмам симметричного шифрования относятся AES (Advanced Encryption Standard), Blowfish, Twofish, а также более новые и быстрые решения, такие как ChaCha20. AES является стандартом де-факто, широко применяемым во множестве систем благодаря своей высокой криптостойкости и протоколам поддержки (например, AES-128, AES-256). Blowfish и Twofish используются в ряде приложений, при этом Blowfish часто применяется для шифрования данных с меньшей длиной блоков, а Twofish – это усовершенствованная версия с большей безопасностью. ChaCha20, популярный благодаря скорости и стойкости к криптоанализу, активно внедряется в мобильных и облачных сервисах, где критична производительность и низкая латентность шифрования.</w:t>
+      </w:r>
+    </w:p>
+    <w:p>
+      <w:pPr>
+        <w:ind w:firstLine="709"/>
+        <w:jc w:val="both"/>
+        <w:rPr>
+          <w:rFonts w:ascii="Times New Roman" w:hAnsi="Times New Roman" w:cs="Times New Roman"/>
+          <w:sz w:val="28"/>
+          <w:szCs w:val="28"/>
+        </w:rPr>
+      </w:pPr>
+      <w:r>
+        <w:rPr>
+          <w:rFonts w:ascii="Times New Roman" w:hAnsi="Times New Roman" w:cs="Times New Roman"/>
+          <w:sz w:val="28"/>
+          <w:szCs w:val="28"/>
+        </w:rPr>
+        <w:t>Основным преимуществом симметрического шифрования является его высокая скорость и меньшая длина ключа по сравнению с асимметричными алгоритмами, что делает его предпочтительным для шифрования больших объемов данных в реальном времени. Основная сложность заключается в надежной передаче и хранении ключей, поскольку компрометация ключа может привести к полной утрате безопасности. Поэтому современные реализации включают механизмы управления ключами, интеграцию с протоколами обмена и использование криптографически стойких генераторов случайных чисел для повышения качества ключей и защиты от атак. Такой подход обеспечивает баланс между эффективностью и уровнем безопасности в условиях современного киберпространства.</w:t>
+      </w:r>
+    </w:p>
+    <w:p>
+      <w:pPr>
+        <w:ind w:firstLine="709"/>
+        <w:jc w:val="both"/>
+        <w:rPr>
+          <w:rFonts w:ascii="Times New Roman" w:hAnsi="Times New Roman" w:cs="Times New Roman"/>
+          <w:sz w:val="28"/>
+          <w:szCs w:val="28"/>
+        </w:rPr>
+      </w:pPr>
+      <w:r>
+        <w:rPr>
+          <w:rFonts w:ascii="Times New Roman" w:hAnsi="Times New Roman" w:cs="Times New Roman"/>
+          <w:sz w:val="28"/>
+          <w:szCs w:val="28"/>
+        </w:rPr>
+        <w:t>3. Основные понятия и классификация средств криптографической защиты информации.</w:t>
+      </w:r>
+    </w:p>
+    <w:p>
+      <w:pPr>
+        <w:ind w:firstLine="709"/>
+        <w:jc w:val="both"/>
+        <w:rPr>
+          <w:rFonts w:ascii="Times New Roman" w:hAnsi="Times New Roman" w:cs="Times New Roman"/>
+          <w:sz w:val="28"/>
+          <w:szCs w:val="28"/>
+        </w:rPr>
+      </w:pPr>
+      <w:r>
+        <w:rPr>
+          <w:rFonts w:ascii="Times New Roman" w:hAnsi="Times New Roman" w:cs="Times New Roman"/>
+          <w:sz w:val="28"/>
+          <w:szCs w:val="28"/>
+        </w:rPr>
+        <w:t xml:space="preserve">Средства криптографической защиты информации (СКЗИ) — это технические, программные или программно-аппаратные комплексы, средства и методы, предназначенные для обеспечения конфиденциальности, целостности, аутентичности и неотказуемости информации. Основные понятия включают симметричное и асимметричное шифрование, хеш-функции, цифровые подписи и протоколы обмена ключами. Симметричное шифрование использует один общий секретный ключ, а асимметричное — пару ключей: открытый и закрытый. Криптографические хеши обеспечивают </w:t>
+      </w:r>
+      <w:r>
+        <w:rPr>
+          <w:rFonts w:ascii="Times New Roman" w:hAnsi="Times New Roman" w:cs="Times New Roman"/>
+          <w:sz w:val="28"/>
+          <w:szCs w:val="28"/>
+        </w:rPr>
+        <w:lastRenderedPageBreak/>
+        <w:t>проверку целостности, а цифровая подпись служит для подтверждения авторства и аутентичности данных.</w:t>
+      </w:r>
+    </w:p>
+    <w:p>
+      <w:pPr>
+        <w:ind w:firstLine="709"/>
+        <w:jc w:val="both"/>
+        <w:rPr>
+          <w:rFonts w:ascii="Times New Roman" w:hAnsi="Times New Roman" w:cs="Times New Roman"/>
+          <w:sz w:val="28"/>
+          <w:szCs w:val="28"/>
+        </w:rPr>
+      </w:pPr>
+      <w:r>
+        <w:rPr>
+          <w:rFonts w:ascii="Times New Roman" w:hAnsi="Times New Roman" w:cs="Times New Roman"/>
+          <w:sz w:val="28"/>
+          <w:szCs w:val="28"/>
+        </w:rPr>
+        <w:t>Классификация средств криптографической защиты основана на различных критериях. По способу реализации выделяют программные СКЗИ, устанавливаемые в виде приложений на компьютерах, и программно-аппаратные, когда все криптографические операции происходят в специализированных устройствах (например, токенах). По уровню защиты СКЗИ классифицируются в соответствии с пятью классами: КС1 — базовый уровень защиты от внешних угроз; КС2 — защита от атак изнутри информационной системы; КС3 — защита от злоумышленников с доступом к самим средствам защиты; КВ и КА — высшие уровни, применяемые для особо важной и государственной тайны, с жесткими требованиями к безопасности и управлению ключами. Каждый последующий класс включает требования предыдущих, усиливая уровень контроля и защищенности.</w:t>
+      </w:r>
+    </w:p>
+    <w:p>
+      <w:pPr>
+        <w:ind w:firstLine="709"/>
+        <w:jc w:val="both"/>
+        <w:rPr>
+          <w:rFonts w:ascii="Times New Roman" w:hAnsi="Times New Roman" w:cs="Times New Roman"/>
+          <w:sz w:val="28"/>
+          <w:szCs w:val="28"/>
+        </w:rPr>
+      </w:pPr>
+      <w:r>
+        <w:rPr>
+          <w:rFonts w:ascii="Times New Roman" w:hAnsi="Times New Roman" w:cs="Times New Roman"/>
+          <w:sz w:val="28"/>
+          <w:szCs w:val="28"/>
+        </w:rPr>
+        <w:t>Выбор и применение конкретных средств криптографической защиты определяется требованиями к уровню конфиденциальности информации и угрозам, с которыми может столкнуться система. Для повседневной коммерческой и операционной информации часто достаточно СКЗИ классов КС1 и КС2, тогда как секретные, военные или особо важные данные требуют СКЗИ с классом КС3 и выше, с использованием сертифицированных алгоритмов, защищенных ключевых хранилищ и аппаратных модулей безопасности. Наличие и обновление перечня средств криптографической защиты позволяет организациям своевременно управлять безопасностью, планировать расходы и мониторить соответствие требованиям нормативных актов. Такой системный подход гарантирует надежную защиту информации в условиях постоянно развивающихся киберугроз.</w:t>
+      </w:r>
+    </w:p>
+    <w:p>
+      <w:pPr>
+        <w:ind w:firstLine="709"/>
+        <w:jc w:val="both"/>
+        <w:rPr>
+          <w:rFonts w:ascii="Times New Roman" w:hAnsi="Times New Roman" w:cs="Times New Roman"/>
+          <w:sz w:val="28"/>
+          <w:szCs w:val="28"/>
+        </w:rPr>
+      </w:pPr>
+      <w:r>
+        <w:rPr>
+          <w:rFonts w:ascii="Times New Roman" w:hAnsi="Times New Roman" w:cs="Times New Roman"/>
+          <w:sz w:val="28"/>
+          <w:szCs w:val="28"/>
+        </w:rPr>
+        <w:t>4. Абсолютно стойкий шифр.</w:t>
+      </w:r>
+    </w:p>
+    <w:p>
+      <w:pPr>
+        <w:ind w:firstLine="709"/>
+        <w:jc w:val="both"/>
+        <w:rPr>
+          <w:rFonts w:ascii="Times New Roman" w:hAnsi="Times New Roman" w:cs="Times New Roman"/>
+          <w:sz w:val="28"/>
+          <w:szCs w:val="28"/>
+        </w:rPr>
+      </w:pPr>
+      <w:r>
+        <w:rPr>
+          <w:rFonts w:ascii="Times New Roman" w:hAnsi="Times New Roman" w:cs="Times New Roman"/>
+          <w:sz w:val="28"/>
+          <w:szCs w:val="28"/>
+        </w:rPr>
+        <w:t>Абсолютно стойкий шифр — это криптографическая система, обладающая максимальным уровнем безопасности, при котором невозможно извлечь какую-либо информацию об исходном сообщении из перехваченного зашифрованного текста вне зависимости от вычислительных ресурсов атакующего. Этот тип шифра был сформулирован и доказан математически Клодом Шенноном в 1945 году, который ввёл понятие абсолютной (или теоретической) стойкости. Главным условием абсолютной стойкости является то, что вероятность восстановления исходного текста без знания ключа равна вероятности случайного угадывания, то есть криптоаналитик не получает статистической информации о ключах и сообщениях.</w:t>
+      </w:r>
+    </w:p>
+    <w:p>
+      <w:pPr>
+        <w:ind w:firstLine="709"/>
+        <w:jc w:val="both"/>
+        <w:rPr>
+          <w:rFonts w:ascii="Times New Roman" w:hAnsi="Times New Roman" w:cs="Times New Roman"/>
+          <w:sz w:val="28"/>
+          <w:szCs w:val="28"/>
+        </w:rPr>
+      </w:pPr>
+      <w:r>
+        <w:rPr>
+          <w:rFonts w:ascii="Times New Roman" w:hAnsi="Times New Roman" w:cs="Times New Roman"/>
+          <w:sz w:val="28"/>
+          <w:szCs w:val="28"/>
+        </w:rPr>
+        <w:t xml:space="preserve">Основным и классическим примером абсолютно стойкого шифра является шифр Вернама, или одноразовый блокнот. Его принцип основан на </w:t>
+      </w:r>
+      <w:r>
+        <w:rPr>
+          <w:rFonts w:ascii="Times New Roman" w:hAnsi="Times New Roman" w:cs="Times New Roman"/>
+          <w:sz w:val="28"/>
+          <w:szCs w:val="28"/>
+        </w:rPr>
+        <w:lastRenderedPageBreak/>
+        <w:t>том, что ключ, используемый для шифрования, равен по длине сообщению, является случайной последовательностью и используется строго один раз. При шифровании происходит побитовое сложение (XOR) сообщения с ключом. Если ключ действительно случайный, секретный и не повторяется, то полученный шифртекст не содержит никакой информации о исходном тексте. Однако на практике применение такого шифра ограничено трудностями в генерации и безопасном распределении длинных ключей.</w:t>
+      </w:r>
+    </w:p>
+    <w:p>
+      <w:pPr>
+        <w:ind w:firstLine="709"/>
+        <w:jc w:val="both"/>
+        <w:rPr>
+          <w:rFonts w:ascii="Times New Roman" w:hAnsi="Times New Roman" w:cs="Times New Roman"/>
+          <w:sz w:val="28"/>
+          <w:szCs w:val="28"/>
+        </w:rPr>
+      </w:pPr>
+      <w:r>
+        <w:rPr>
+          <w:rFonts w:ascii="Times New Roman" w:hAnsi="Times New Roman" w:cs="Times New Roman"/>
+          <w:sz w:val="28"/>
+          <w:szCs w:val="28"/>
+        </w:rPr>
+        <w:t>Практическое использование абсолютно стойких систем возможно в строго ограниченных сценариях, например, в военных и правительственных коммуникациях с доступом к надежным каналам передачи ключей. Для большинства коммерческих и повседневных задач сложность и стоимость реализации таких систем оказываются неоправданно высокими, что приводит к использованию устойчивых, но не абсолютно стойких алгоритмов. Тем не менее, понятие абсолютной стойкости остается краеугольным камнем криптографии, служа теоретическим ориентиром и базой для разработки современных безопасных криптографических протоколов.</w:t>
+      </w:r>
+    </w:p>
+    <w:p>
+      <w:pPr>
+        <w:ind w:firstLine="709"/>
+        <w:jc w:val="both"/>
+        <w:rPr>
+          <w:rFonts w:ascii="Times New Roman" w:hAnsi="Times New Roman" w:cs="Times New Roman"/>
+          <w:sz w:val="28"/>
+          <w:szCs w:val="28"/>
+        </w:rPr>
+      </w:pPr>
+      <w:r>
+        <w:rPr>
+          <w:rFonts w:ascii="Times New Roman" w:hAnsi="Times New Roman" w:cs="Times New Roman"/>
+          <w:sz w:val="28"/>
+          <w:szCs w:val="28"/>
+        </w:rPr>
+        <w:t>5. Принципы создания и свойства асимметрических криптосистем. Примеры асимметрических криптосистем.</w:t>
+      </w:r>
+    </w:p>
+    <w:p>
+      <w:pPr>
+        <w:ind w:firstLine="709"/>
+        <w:jc w:val="both"/>
+        <w:rPr>
+          <w:rFonts w:ascii="Times New Roman" w:hAnsi="Times New Roman" w:cs="Times New Roman"/>
+          <w:sz w:val="28"/>
+          <w:szCs w:val="28"/>
+        </w:rPr>
+      </w:pPr>
+      <w:r>
+        <w:rPr>
+          <w:rFonts w:ascii="Times New Roman" w:hAnsi="Times New Roman" w:cs="Times New Roman"/>
+          <w:sz w:val="28"/>
+          <w:szCs w:val="28"/>
+        </w:rPr>
+        <w:t>Асимметрические криптосистемы базируются на принципе использования двух различных, но математически связанных ключей — открытого (публичного) и закрытого (приватного). Открытый ключ служит для шифрования информации и может свободно распространяться, тогда как закрытый ключ используется для расшифровки и хранится только у владельца. В основе таких систем лежат однонаправленные функции, которые легко вычисляются в одном направлении, но крайне сложны для обратного вычисления без специальной информации (закрытого ключа). Это обеспечивает надежную защиту данных, даже если открытый ключ известен потенциальному злоумышленнику.</w:t>
+      </w:r>
+    </w:p>
+    <w:p>
+      <w:pPr>
+        <w:ind w:firstLine="709"/>
+        <w:jc w:val="both"/>
+        <w:rPr>
+          <w:rFonts w:ascii="Times New Roman" w:hAnsi="Times New Roman" w:cs="Times New Roman"/>
+          <w:sz w:val="28"/>
+          <w:szCs w:val="28"/>
+        </w:rPr>
+      </w:pPr>
+      <w:r>
+        <w:rPr>
+          <w:rFonts w:ascii="Times New Roman" w:hAnsi="Times New Roman" w:cs="Times New Roman"/>
+          <w:sz w:val="28"/>
+          <w:szCs w:val="28"/>
+        </w:rPr>
+        <w:t>Ключевые требования к асимметричным криптосистемам — это возможность эффективного шифрования и дешифрования при невозможности восстановления закрытого ключа из открытого, а также стойкость к текущим вычислительным методам криптоанализа. Такие системы решают основную проблему симметричного шифрования — безопасную передачу ключей. Среди наиболее распространённых алгоритмов — RSA, основанный на сложности факторизации больших чисел; DSA и схема Эль-Гамаля, опирающиеся на трудности вычисления дискретных логарифмов; ECDSA, использующий эллиптические кривые для создания цифровых подписей и популярный в криптовалютах.</w:t>
+      </w:r>
+    </w:p>
+    <w:p>
+      <w:pPr>
+        <w:ind w:firstLine="709"/>
+        <w:jc w:val="both"/>
+        <w:rPr>
+          <w:rFonts w:ascii="Times New Roman" w:hAnsi="Times New Roman" w:cs="Times New Roman"/>
+          <w:sz w:val="28"/>
+          <w:szCs w:val="28"/>
+        </w:rPr>
+      </w:pPr>
+      <w:r>
+        <w:rPr>
+          <w:rFonts w:ascii="Times New Roman" w:hAnsi="Times New Roman" w:cs="Times New Roman"/>
+          <w:sz w:val="28"/>
+          <w:szCs w:val="28"/>
+        </w:rPr>
+        <w:lastRenderedPageBreak/>
+        <w:t>Практическое использование асимметрических методов часто комбинируется с симметричным шифрованием для оптимизации скорости и безопасности. К примеру, в протоколах SSL/TLS асимметричные алгоритмы применяются для передачи ключей симметричного шифра, который затем обеспечивает быструю шифровку основного объема данных. Помимо защиты каналов связи, асимметричная криптография широко используется для создания электронных подписей, которые подтверждают подлинность и целостность документации. Такой подход обеспечивает комплексную информационную безопасность и соответствует современным требованиям к защите цифровой информации.</w:t>
+      </w:r>
+    </w:p>
+    <w:p>
+      <w:pPr>
+        <w:ind w:firstLine="709"/>
+        <w:jc w:val="both"/>
+        <w:rPr>
+          <w:rFonts w:ascii="Times New Roman" w:hAnsi="Times New Roman" w:cs="Times New Roman"/>
+          <w:sz w:val="28"/>
+          <w:szCs w:val="28"/>
+        </w:rPr>
+      </w:pPr>
+      <w:r>
+        <w:rPr>
+          <w:rFonts w:ascii="Times New Roman" w:hAnsi="Times New Roman" w:cs="Times New Roman"/>
+          <w:sz w:val="28"/>
+          <w:szCs w:val="28"/>
+        </w:rPr>
+        <w:t>6. Методы криптографии.</w:t>
+      </w:r>
+    </w:p>
+    <w:p>
+      <w:pPr>
+        <w:ind w:firstLine="709"/>
+        <w:jc w:val="both"/>
+        <w:rPr>
+          <w:rFonts w:ascii="Times New Roman" w:hAnsi="Times New Roman" w:cs="Times New Roman"/>
+          <w:sz w:val="28"/>
+          <w:szCs w:val="28"/>
+        </w:rPr>
+      </w:pPr>
+      <w:r>
+        <w:rPr>
+          <w:rFonts w:ascii="Times New Roman" w:hAnsi="Times New Roman" w:cs="Times New Roman"/>
+          <w:sz w:val="28"/>
+          <w:szCs w:val="28"/>
+        </w:rPr>
+        <w:t>Методы криптографии представляют собой различные техники и алгоритмы, позволяющие обеспечивать конфиденциальность, целостность и аутентичность информации. Основные методы включают симметричное шифрование, при котором для шифрования и расшифровки используется один и тот же секретный ключ, и асимметричное шифрование, где применяется пара ключей — открытый и закрытый. Кроме того, широко используются хеш-функции, которые преобразуют данные в уникальные фиксированной длины значения, служащие для проверки целостности и аутентичности сообщений.</w:t>
+      </w:r>
+    </w:p>
+    <w:p>
+      <w:pPr>
+        <w:ind w:firstLine="709"/>
+        <w:jc w:val="both"/>
+        <w:rPr>
+          <w:rFonts w:ascii="Times New Roman" w:hAnsi="Times New Roman" w:cs="Times New Roman"/>
+          <w:sz w:val="28"/>
+          <w:szCs w:val="28"/>
+        </w:rPr>
+      </w:pPr>
+      <w:r>
+        <w:rPr>
+          <w:rFonts w:ascii="Times New Roman" w:hAnsi="Times New Roman" w:cs="Times New Roman"/>
+          <w:sz w:val="28"/>
+          <w:szCs w:val="28"/>
+        </w:rPr>
+        <w:t>Другой ключевой метод — цифровая подпись, позволяющая подтверждать авторство и целостность документов, а также аутентифицировать пользователей и транзакции. В дополнение к этим технологиям существует стеганография — способ скрытия информации внутри других данных (например, изображений), что позволяет спрятать факт передачи секретных сообщений. Кроме того, кодирование, часто путаемое с шифрованием, заключается в преобразовании данных согласно определённым правилам, и используется для упрощения передачи или хранения информации.</w:t>
+      </w:r>
+    </w:p>
+    <w:p>
+      <w:pPr>
+        <w:ind w:firstLine="709"/>
+        <w:jc w:val="both"/>
+        <w:rPr>
+          <w:rFonts w:ascii="Times New Roman" w:hAnsi="Times New Roman" w:cs="Times New Roman"/>
+          <w:sz w:val="28"/>
+          <w:szCs w:val="28"/>
+        </w:rPr>
+      </w:pPr>
+      <w:r>
+        <w:rPr>
+          <w:rFonts w:ascii="Times New Roman" w:hAnsi="Times New Roman" w:cs="Times New Roman"/>
+          <w:sz w:val="28"/>
+          <w:szCs w:val="28"/>
+        </w:rPr>
+        <w:t>Современные криптографические методы опираются на сложные математические алгоритмы и разнообразные протоколы, таких как AES, RSA, SHA-3 и другие, а также на концепции, обеспечивающие защиту в условиях постоянно развивающихся угроз. Одной из важнейших сфер развития является квантовая криптография, которая использует квантовые явления для создания практически неуязвимых систем. Благодаря сочетанию этих методов достигается комплексная и многоуровневая защита информации в разнообразных сферах — от финансов до государственных систем безопасности.</w:t>
+      </w:r>
+    </w:p>
+    <w:p>
+      <w:pPr>
+        <w:ind w:firstLine="709"/>
+        <w:jc w:val="both"/>
+        <w:rPr>
+          <w:rFonts w:ascii="Times New Roman" w:hAnsi="Times New Roman" w:cs="Times New Roman"/>
+          <w:sz w:val="28"/>
+          <w:szCs w:val="28"/>
+        </w:rPr>
+      </w:pPr>
+      <w:r>
+        <w:rPr>
+          <w:rFonts w:ascii="Times New Roman" w:hAnsi="Times New Roman" w:cs="Times New Roman"/>
+          <w:sz w:val="28"/>
+          <w:szCs w:val="28"/>
+        </w:rPr>
+        <w:t>7. Классификация шифров по различным признакам.</w:t>
+      </w:r>
+    </w:p>
+    <w:p>
+      <w:pPr>
+        <w:ind w:firstLine="709"/>
+        <w:jc w:val="both"/>
+        <w:rPr>
+          <w:rFonts w:ascii="Times New Roman" w:hAnsi="Times New Roman" w:cs="Times New Roman"/>
+          <w:sz w:val="28"/>
+          <w:szCs w:val="28"/>
+        </w:rPr>
+      </w:pPr>
+      <w:r>
+        <w:rPr>
+          <w:rFonts w:ascii="Times New Roman" w:hAnsi="Times New Roman" w:cs="Times New Roman"/>
+          <w:sz w:val="28"/>
+          <w:szCs w:val="28"/>
+        </w:rPr>
+        <w:t xml:space="preserve">Классификация шифров по различным признакам является фундаментальной для понимания криптографии и выбора подходящих </w:t>
+      </w:r>
+      <w:r>
+        <w:rPr>
+          <w:rFonts w:ascii="Times New Roman" w:hAnsi="Times New Roman" w:cs="Times New Roman"/>
+          <w:sz w:val="28"/>
+          <w:szCs w:val="28"/>
+        </w:rPr>
+        <w:lastRenderedPageBreak/>
+        <w:t>методов защиты информации. Первый и основной признак — наличие ключа, по которому шифр делится на тайнопись (без ключа) и криптографические шифры (с ключом). Далее шифры классифицируются по соответствию ключей: симметричные, где для шифрования и расшифровки используется один и тот же ключ, и асимметричные, использующие пару ключей — открытый и закрытый. Важным признаком также является характер обрабатываемых данных: блочные шифры работают с фиксированными блоками данных, а потоковые — с потоками битов или байтов.</w:t>
+      </w:r>
+    </w:p>
+    <w:p>
+      <w:pPr>
+        <w:ind w:firstLine="709"/>
+        <w:jc w:val="both"/>
+        <w:rPr>
+          <w:rFonts w:ascii="Times New Roman" w:hAnsi="Times New Roman" w:cs="Times New Roman"/>
+          <w:sz w:val="28"/>
+          <w:szCs w:val="28"/>
+        </w:rPr>
+      </w:pPr>
+      <w:r>
+        <w:rPr>
+          <w:rFonts w:ascii="Times New Roman" w:hAnsi="Times New Roman" w:cs="Times New Roman"/>
+          <w:sz w:val="28"/>
+          <w:szCs w:val="28"/>
+        </w:rPr>
+        <w:t>Еще одна классификация основана на типе используемых преобразований: подстановочные шифры заменяют элементы сообщения согласно определённым правилам, перестановочные изменяют порядок элементов, а комбинированные используют оба типа. Также по размеру блока шифруемые данные делятся на крупные (например, 128 бит в AES) и мелкие, что влияет на устойчивость и сложность атак. Классификация может учитывать и свойства защиты – от простейших алгоритмов с низким уровнем стойкости до мощных систем, сертифицированных для защиты государственных тайн.</w:t>
+      </w:r>
+    </w:p>
+    <w:p>
+      <w:pPr>
         <w:ind w:firstLine="709"/>
         <w:jc w:val="both"/>
         <w:rPr>
@@ -20,1206 +578,8 @@
           <w:sz w:val="28"/>
           <w:szCs w:val="28"/>
         </w:rPr>
-        <w:t>1. Построение системы защиты информации в организации.</w:t>
-      </w:r>
-    </w:p>
-    <w:p>
-      <w:pPr>
-        <w:ind w:firstLine="709"/>
-        <w:jc w:val="both"/>
-        <w:rPr>
-          <w:rFonts w:ascii="Times New Roman" w:hAnsi="Times New Roman" w:cs="Times New Roman"/>
-          <w:sz w:val="28"/>
-          <w:szCs w:val="28"/>
-        </w:rPr>
-      </w:pPr>
-      <w:r>
-        <w:rPr>
-          <w:rFonts w:ascii="Times New Roman" w:hAnsi="Times New Roman" w:cs="Times New Roman"/>
-          <w:sz w:val="28"/>
-          <w:szCs w:val="28"/>
-        </w:rPr>
-        <w:t>Построение системы защиты информации в организации начинается с анализа текущего состояния информационных ресурсов и определения целей безопасности. Важно провести классификацию данных и оценку рисков, учитывая угрозы и уязвимости, которые могут привести к потере конфиденциальности, целостности или доступности информации. При этом следует опираться на требования законодательства, например, ФЗ-152 "О персональных данных" и соответствующие ГОСТы, что обеспечивает соответствие нормативным требованиям и минимизацию юридических рисков.</w:t>
-      </w:r>
-    </w:p>
-    <w:p>
-      <w:pPr>
-        <w:ind w:firstLine="709"/>
-        <w:jc w:val="both"/>
-        <w:rPr>
-          <w:rFonts w:ascii="Times New Roman" w:hAnsi="Times New Roman" w:cs="Times New Roman"/>
-          <w:sz w:val="28"/>
-          <w:szCs w:val="28"/>
-        </w:rPr>
-      </w:pPr>
-      <w:r>
-        <w:rPr>
-          <w:rFonts w:ascii="Times New Roman" w:hAnsi="Times New Roman" w:cs="Times New Roman"/>
-          <w:sz w:val="28"/>
-          <w:szCs w:val="28"/>
-        </w:rPr>
-        <w:t>Далее формируется комплекс организационно-технических мер, включающий настройку контроля доступа, использование криптографии, защиту сетевой инфраструктуры и реализацию антивирусной защиты. Также разрабатываются внутренние документы — политика безопасности, инструкции и регламенты, которые регламентируют порядок обращения и защиты информации. Значительное внимание уделяется обучению сотрудников и формированию корпоративной культуры безопасности, поскольку человеческий фактор остается одной из ключевых уязвимостей.</w:t>
-      </w:r>
-    </w:p>
-    <w:p>
-      <w:pPr>
-        <w:ind w:firstLine="709"/>
-        <w:jc w:val="both"/>
-        <w:rPr>
-          <w:rFonts w:ascii="Times New Roman" w:hAnsi="Times New Roman" w:cs="Times New Roman"/>
-          <w:sz w:val="28"/>
-          <w:szCs w:val="28"/>
-        </w:rPr>
-      </w:pPr>
-      <w:r>
-        <w:rPr>
-          <w:rFonts w:ascii="Times New Roman" w:hAnsi="Times New Roman" w:cs="Times New Roman"/>
-          <w:sz w:val="28"/>
-          <w:szCs w:val="28"/>
-        </w:rPr>
-        <w:t>Наконец, система защиты должна быть динамичной, с регулярным проведением аудитов и мониторингом инцидентов. Это позволяет своевременно выявлять и устранять недостатки, а также адаптировать меры безопасности к изменяющимся условиям и новым угрозам. Важно, что защита информации — это не просто техническая задача, а комплексное управление, включающее организационные, правовые и технические аспекты, направленные на устойчивое функционирование бизнеса и защиту данных.</w:t>
-      </w:r>
-    </w:p>
-    <w:p>
-      <w:pPr>
-        <w:ind w:firstLine="709"/>
-        <w:jc w:val="both"/>
-        <w:rPr>
-          <w:rFonts w:ascii="Times New Roman" w:hAnsi="Times New Roman" w:cs="Times New Roman"/>
-          <w:sz w:val="28"/>
-          <w:szCs w:val="28"/>
-        </w:rPr>
-      </w:pPr>
-      <w:r>
-        <w:rPr>
-          <w:rFonts w:ascii="Times New Roman" w:hAnsi="Times New Roman" w:cs="Times New Roman"/>
-          <w:sz w:val="28"/>
-          <w:szCs w:val="28"/>
-        </w:rPr>
-        <w:t>2. Современные методики анализа и управления рисками информационной безопасности.</w:t>
-      </w:r>
-    </w:p>
-    <w:p>
-      <w:pPr>
-        <w:ind w:firstLine="709"/>
-        <w:jc w:val="both"/>
-        <w:rPr>
-          <w:rFonts w:ascii="Times New Roman" w:hAnsi="Times New Roman" w:cs="Times New Roman"/>
-          <w:sz w:val="28"/>
-          <w:szCs w:val="28"/>
-        </w:rPr>
-      </w:pPr>
-      <w:r>
-        <w:rPr>
-          <w:rFonts w:ascii="Times New Roman" w:hAnsi="Times New Roman" w:cs="Times New Roman"/>
-          <w:sz w:val="28"/>
-          <w:szCs w:val="28"/>
-        </w:rPr>
-        <w:t>Современные методики анализа и управления рисками информационной безопасности основываются на системном подходе и призваны обеспечить выявление, оценку и минимизацию угроз для информационных активов организации. На практике применяются разные методологии, среди которых выделяются FRAP (Facilitated Risk Analysis Process), OCTAVE, CRAMM и CORAS. Эти методы предлагает сочетание качественного и количественного анализа рисков, что помогает определить наиболее критичные активы и выявить слабые места защиты. При этом ключевой задачей является адаптация управления рисками под конкретные бизнес-процессы и инфраструктуру организации, что повышает эффективность защитных мероприятий.</w:t>
-      </w:r>
-    </w:p>
-    <w:p>
-      <w:pPr>
-        <w:ind w:firstLine="709"/>
-        <w:jc w:val="both"/>
-        <w:rPr>
-          <w:rFonts w:ascii="Times New Roman" w:hAnsi="Times New Roman" w:cs="Times New Roman"/>
-          <w:sz w:val="28"/>
-          <w:szCs w:val="28"/>
-        </w:rPr>
-      </w:pPr>
-      <w:r>
-        <w:rPr>
-          <w:rFonts w:ascii="Times New Roman" w:hAnsi="Times New Roman" w:cs="Times New Roman"/>
-          <w:sz w:val="28"/>
-          <w:szCs w:val="28"/>
-        </w:rPr>
-        <w:t xml:space="preserve">Особое внимание уделяется соблюдению национальных стандартов, таких как ГОСТ Р ИСО/МЭК 27005, которые регламентируют порядок </w:t>
-      </w:r>
-      <w:r>
-        <w:rPr>
-          <w:rFonts w:ascii="Times New Roman" w:hAnsi="Times New Roman" w:cs="Times New Roman"/>
-          <w:sz w:val="28"/>
-          <w:szCs w:val="28"/>
-        </w:rPr>
-        <w:lastRenderedPageBreak/>
-        <w:t>организации системы управления рисками информационной безопасности. Этот стандарт, являющийся адаптацией международного ISO/IEC 27005, описывает основные этапы работы с рисками — от их идентификации и оценки до обработки и мониторинга. Важным становится системное документирование всех процедур и принятие решений, что обеспечивает прозрачность и возможность постоянного улучшения управления рисками. Кроме того, стандарты учитывают необходимость реагирования на инциденты и планирования действий по восстановлению после атак.</w:t>
-      </w:r>
-    </w:p>
-    <w:p>
-      <w:pPr>
-        <w:ind w:firstLine="709"/>
-        <w:jc w:val="both"/>
-        <w:rPr>
-          <w:rFonts w:ascii="Times New Roman" w:hAnsi="Times New Roman" w:cs="Times New Roman"/>
-          <w:sz w:val="28"/>
-          <w:szCs w:val="28"/>
-        </w:rPr>
-      </w:pPr>
-      <w:r>
-        <w:rPr>
-          <w:rFonts w:ascii="Times New Roman" w:hAnsi="Times New Roman" w:cs="Times New Roman"/>
-          <w:sz w:val="28"/>
-          <w:szCs w:val="28"/>
-        </w:rPr>
-        <w:t>В современной практике управления рисками применяются как ручные экспертные методы, так и автоматизированные инструменты, которые позволяют ускорить оценку и повысить точность анализа. Управление рисками интегрируется в общую систему информационной безопасности и корпоративное управление, включая обучение сотрудников, развитие культуры безопасности и взаимодействие с поставщиками ИТ-услуг. Такой комплексный подход способствует снижению вероятности инцидентов и уменьшению потенциального ущерба для организации, что особенно важно в условиях постоянного роста киберугроз и усложнения ИТ-инфраструктуры.</w:t>
-      </w:r>
-    </w:p>
-    <w:p>
-      <w:pPr>
-        <w:ind w:firstLine="709"/>
-        <w:jc w:val="both"/>
-        <w:rPr>
-          <w:rFonts w:ascii="Times New Roman" w:hAnsi="Times New Roman" w:cs="Times New Roman"/>
-          <w:sz w:val="28"/>
-          <w:szCs w:val="28"/>
-        </w:rPr>
-      </w:pPr>
-      <w:r>
-        <w:rPr>
-          <w:rFonts w:ascii="Times New Roman" w:hAnsi="Times New Roman" w:cs="Times New Roman"/>
-          <w:sz w:val="28"/>
-          <w:szCs w:val="28"/>
-        </w:rPr>
-        <w:t xml:space="preserve">3. </w:t>
-      </w:r>
-      <w:r>
-        <w:rPr>
-          <w:rFonts w:ascii="Times New Roman" w:hAnsi="Times New Roman" w:cs="Times New Roman"/>
-          <w:sz w:val="28"/>
-          <w:szCs w:val="28"/>
-        </w:rPr>
-        <w:t>Основные программно-технические меры безопасности информации: идентификация и аутентификация; управление доступом.</w:t>
-      </w:r>
-    </w:p>
-    <w:p>
-      <w:pPr>
-        <w:ind w:firstLine="709"/>
-        <w:jc w:val="both"/>
-        <w:rPr>
-          <w:rFonts w:ascii="Times New Roman" w:hAnsi="Times New Roman" w:cs="Times New Roman"/>
-          <w:sz w:val="28"/>
-          <w:szCs w:val="28"/>
-        </w:rPr>
-      </w:pPr>
-      <w:r>
-        <w:rPr>
-          <w:rFonts w:ascii="Times New Roman" w:hAnsi="Times New Roman" w:cs="Times New Roman"/>
-          <w:sz w:val="28"/>
-          <w:szCs w:val="28"/>
-        </w:rPr>
-        <w:t>Основные программно-технические меры безопасности информации включают идентификацию и аутентификацию пользователей, а также управление доступом к информационным ресурсам. Идентификация — это процесс однозначного определения пользователя или устройства в системе, который производится путем предъявления уникального имени или идентификатора. Аутентификация же подтверждает, что субъект действительно является тем, за кого себя выдает, чаще всего с помощью пароля, биометрии, токенов или многофакторной аутентификации. Эти меры предотвращают несанкционированный доступ и обеспечивают основу для построения безопасной системы управления доступом.</w:t>
-      </w:r>
-    </w:p>
-    <w:p>
-      <w:pPr>
-        <w:ind w:firstLine="709"/>
-        <w:jc w:val="both"/>
-        <w:rPr>
-          <w:rFonts w:ascii="Times New Roman" w:hAnsi="Times New Roman" w:cs="Times New Roman"/>
-          <w:sz w:val="28"/>
-          <w:szCs w:val="28"/>
-        </w:rPr>
-      </w:pPr>
-      <w:r>
-        <w:rPr>
-          <w:rFonts w:ascii="Times New Roman" w:hAnsi="Times New Roman" w:cs="Times New Roman"/>
-          <w:sz w:val="28"/>
-          <w:szCs w:val="28"/>
-        </w:rPr>
-        <w:t>Управление доступом предполагает определение прав и ограничений для каждого пользователя или группы, чтобы обеспечить доступ только к тем ресурсам, которые необходимы для выполнения их задач. Это реализуется через системы разграничения доступа, ролей и политик безопасности, применяемых на уровне операционных систем, приложений и сетевого оборудования. Дополнительно используются программные средства, такие как межсетевые экраны (фаерволы), системы обнаружения вторжений и средства шифрования, которые усиливают контроль и защищают данные от копирования и модификации.</w:t>
-      </w:r>
-    </w:p>
-    <w:p>
-      <w:pPr>
-        <w:ind w:firstLine="709"/>
-        <w:jc w:val="both"/>
-        <w:rPr>
-          <w:rFonts w:ascii="Times New Roman" w:hAnsi="Times New Roman" w:cs="Times New Roman"/>
-          <w:sz w:val="28"/>
-          <w:szCs w:val="28"/>
-        </w:rPr>
-      </w:pPr>
-      <w:r>
-        <w:rPr>
-          <w:rFonts w:ascii="Times New Roman" w:hAnsi="Times New Roman" w:cs="Times New Roman"/>
-          <w:sz w:val="28"/>
-          <w:szCs w:val="28"/>
-        </w:rPr>
-        <w:lastRenderedPageBreak/>
-        <w:t>Современные российские практики часто включают сочетание программных и аппаратных средств защиты, что повышает надежность системы. Например, использование криптографических токенов или смарт-карт для аутентификации в сочетании с программными политиками доступа обеспечивает высокий уровень безопасности как в государственных, так и в коммерческих организациях. Важной частью является также регулярное обновление программного обеспечения и обучение персонала, поскольку человеческий фактор остается одним из самых уязвимых элементов в системе защиты информации</w:t>
-      </w:r>
-      <w:r>
-        <w:rPr>
-          <w:rFonts w:ascii="Times New Roman" w:hAnsi="Times New Roman" w:cs="Times New Roman"/>
-          <w:sz w:val="28"/>
-          <w:szCs w:val="28"/>
-        </w:rPr>
-        <w:t>.</w:t>
-      </w:r>
-    </w:p>
-    <w:p>
-      <w:pPr>
-        <w:ind w:firstLine="709"/>
-        <w:jc w:val="both"/>
-        <w:rPr>
-          <w:rFonts w:ascii="Times New Roman" w:hAnsi="Times New Roman" w:cs="Times New Roman"/>
-          <w:sz w:val="28"/>
-          <w:szCs w:val="28"/>
-        </w:rPr>
-      </w:pPr>
-      <w:r>
-        <w:rPr>
-          <w:rFonts w:ascii="Times New Roman" w:hAnsi="Times New Roman" w:cs="Times New Roman"/>
-          <w:sz w:val="28"/>
-          <w:szCs w:val="28"/>
-        </w:rPr>
-        <w:t>4. Основные программно-технические меры безопасности информации: протоколирование, аудит, шифрование, контроль целостности, электронная подпись.</w:t>
-      </w:r>
-    </w:p>
-    <w:p>
-      <w:pPr>
-        <w:ind w:firstLine="709"/>
-        <w:jc w:val="both"/>
-        <w:rPr>
-          <w:rFonts w:ascii="Times New Roman" w:hAnsi="Times New Roman" w:cs="Times New Roman"/>
-          <w:sz w:val="28"/>
-          <w:szCs w:val="28"/>
-        </w:rPr>
-      </w:pPr>
-      <w:r>
-        <w:rPr>
-          <w:rFonts w:ascii="Times New Roman" w:hAnsi="Times New Roman" w:cs="Times New Roman"/>
-          <w:sz w:val="28"/>
-          <w:szCs w:val="28"/>
-        </w:rPr>
-        <w:t>Основные программно-технические меры безопасности информации включают протоколирование, аудит, шифрование, контроль целостности и использование электронной подписи — каждая из них играет важную роль в комплексной защите данных. Протоколирование и аудит позволяют фиксировать все действия пользователей и систем, создавая журнал событий для последующего анализа. Это повышает прозрачность работы информационной системы, помогает выявлять нарушения и инциденты, а также служит основой для расследования и восстановления после атак.</w:t>
-      </w:r>
-    </w:p>
-    <w:p>
-      <w:pPr>
-        <w:ind w:firstLine="709"/>
-        <w:jc w:val="both"/>
-        <w:rPr>
-          <w:rFonts w:ascii="Times New Roman" w:hAnsi="Times New Roman" w:cs="Times New Roman"/>
-          <w:sz w:val="28"/>
-          <w:szCs w:val="28"/>
-        </w:rPr>
-      </w:pPr>
-      <w:r>
-        <w:rPr>
-          <w:rFonts w:ascii="Times New Roman" w:hAnsi="Times New Roman" w:cs="Times New Roman"/>
-          <w:sz w:val="28"/>
-          <w:szCs w:val="28"/>
-        </w:rPr>
-        <w:t>Шифрование является одним из ключевых средств защиты конфиденциальности информации — при помощи криптографических алгоритмов данные преобразуются так, что без ключа доступа к ним получить невозможно. Современные методы используют стандарты, такие как AES и RSA, которые обеспечивают высокую стойкость даже при большом вычислительном ресурсе злоумышленников. Контроль целостности, в свою очередь, отвечает за своевременное обнаружение изменений или повреждений данных через хеш-функции и контрольные суммы, что защищает от фальсификаций и ошибок.</w:t>
-      </w:r>
-    </w:p>
-    <w:p>
-      <w:pPr>
-        <w:ind w:firstLine="709"/>
-        <w:jc w:val="both"/>
-        <w:rPr>
-          <w:rFonts w:ascii="Times New Roman" w:hAnsi="Times New Roman" w:cs="Times New Roman"/>
-          <w:sz w:val="28"/>
-          <w:szCs w:val="28"/>
-        </w:rPr>
-      </w:pPr>
-      <w:r>
-        <w:rPr>
-          <w:rFonts w:ascii="Times New Roman" w:hAnsi="Times New Roman" w:cs="Times New Roman"/>
-          <w:sz w:val="28"/>
-          <w:szCs w:val="28"/>
-        </w:rPr>
-        <w:t>Электронная подпись — это инструмент не только защиты, но и юридического подтверждения подлинности документа или сообщения. Она гарантирует авторство и целостность информации, что особенно важно для обмена официальными данными и договорными отношениями. В совокупности эти меры обеспечивают многоуровневую защиту информации, делая ее прозрачной, проверяемой и устойчивой к внешним и внутренним угрозам. Их грамотное применение обеспечивает надежную работу информационных систем и соответствует требованиям современных стандартов безопасности.</w:t>
-      </w:r>
-    </w:p>
-    <w:p>
-      <w:pPr>
-        <w:ind w:firstLine="709"/>
-        <w:jc w:val="both"/>
-        <w:rPr>
-          <w:rFonts w:ascii="Times New Roman" w:hAnsi="Times New Roman" w:cs="Times New Roman"/>
-          <w:sz w:val="28"/>
-          <w:szCs w:val="28"/>
-        </w:rPr>
-      </w:pPr>
-      <w:r>
-        <w:rPr>
-          <w:rFonts w:ascii="Times New Roman" w:hAnsi="Times New Roman" w:cs="Times New Roman"/>
-          <w:sz w:val="28"/>
-          <w:szCs w:val="28"/>
-        </w:rPr>
-        <w:t>5. Проблемы защиты информации в информационных системах.</w:t>
-      </w:r>
-    </w:p>
-    <w:p>
-      <w:pPr>
-        <w:ind w:firstLine="709"/>
-        <w:jc w:val="both"/>
-        <w:rPr>
-          <w:rFonts w:ascii="Times New Roman" w:hAnsi="Times New Roman" w:cs="Times New Roman"/>
-          <w:sz w:val="28"/>
-          <w:szCs w:val="28"/>
-        </w:rPr>
-      </w:pPr>
-      <w:r>
-        <w:rPr>
-          <w:rFonts w:ascii="Times New Roman" w:hAnsi="Times New Roman" w:cs="Times New Roman"/>
-          <w:sz w:val="28"/>
-          <w:szCs w:val="28"/>
-        </w:rPr>
-        <w:lastRenderedPageBreak/>
-        <w:t>Проблемы защиты информации в информационных системах связаны с комплексом технических, организационных и человеческих факторов, которые создают уязвимости и угрозы для данных. Одной из ключевых проблем является несанкционированный доступ, когда злоумышленники или неквалифицированные пользователи пытаются получить доступ к конфиденциальной информации. Это проявляется в перехвате, изменении или уничтожении данных, а также в подделке авторства. Такая угроза усиливается из-за динамичности ИТ-инфраструктуры и всё растущей сложности сетевых систем.</w:t>
-      </w:r>
-    </w:p>
-    <w:p>
-      <w:pPr>
-        <w:ind w:firstLine="709"/>
-        <w:jc w:val="both"/>
-        <w:rPr>
-          <w:rFonts w:ascii="Times New Roman" w:hAnsi="Times New Roman" w:cs="Times New Roman"/>
-          <w:sz w:val="28"/>
-          <w:szCs w:val="28"/>
-        </w:rPr>
-      </w:pPr>
-      <w:r>
-        <w:rPr>
-          <w:rFonts w:ascii="Times New Roman" w:hAnsi="Times New Roman" w:cs="Times New Roman"/>
-          <w:sz w:val="28"/>
-          <w:szCs w:val="28"/>
-        </w:rPr>
-        <w:t>Еще одной существенной проблемой является сохранение целостности и доступности информации. В связи с распространением компьютерных вирусов, программ-шпионов и прочих вредоносных программ, данные могут быть повреждены или искажены. Наряду с этим, технологические сбои и ошибки сотрудников могут привести к потере важных данных или сбоям в работе систем. Управление коллективным доступом к ресурсам в локальных сетях также вызывает сложности, особенно когда необходимо одновременно обеспечить безопасность и удобство работы пользователей.</w:t>
-      </w:r>
-    </w:p>
-    <w:p>
-      <w:pPr>
-        <w:ind w:firstLine="709"/>
-        <w:jc w:val="both"/>
-        <w:rPr>
-          <w:rFonts w:ascii="Times New Roman" w:hAnsi="Times New Roman" w:cs="Times New Roman"/>
-          <w:sz w:val="28"/>
-          <w:szCs w:val="28"/>
-        </w:rPr>
-      </w:pPr>
-      <w:r>
-        <w:rPr>
-          <w:rFonts w:ascii="Times New Roman" w:hAnsi="Times New Roman" w:cs="Times New Roman"/>
-          <w:sz w:val="28"/>
-          <w:szCs w:val="28"/>
-        </w:rPr>
-        <w:t>Кроме того, защиту информации осложняет необходимость постоянного соблюдения законодательства и нормативных требований, таких как ФЗ-152, ГОСТы и банковские стандарты. Организация комплексной защиты требует не только технических средств — криптозащиты, фаерволов, систем контроля доступа — но и продуманной политики безопасности, регулярного обучения персонала и проведения аудитов. Актуальность этих проблем продолжает расти вместе с развитием технологий и появлением новых видов кибератак, что требует постоянного совершенствования систем защиты.</w:t>
-      </w:r>
-    </w:p>
-    <w:p>
-      <w:pPr>
-        <w:ind w:firstLine="709"/>
-        <w:jc w:val="both"/>
-        <w:rPr>
-          <w:rFonts w:ascii="Times New Roman" w:hAnsi="Times New Roman" w:cs="Times New Roman"/>
-          <w:sz w:val="28"/>
-          <w:szCs w:val="28"/>
-        </w:rPr>
-      </w:pPr>
-      <w:r>
-        <w:rPr>
-          <w:rFonts w:ascii="Times New Roman" w:hAnsi="Times New Roman" w:cs="Times New Roman"/>
-          <w:sz w:val="28"/>
-          <w:szCs w:val="28"/>
-        </w:rPr>
-        <w:t>6. Задачи системы безопасности.</w:t>
-      </w:r>
-    </w:p>
-    <w:p>
-      <w:pPr>
-        <w:ind w:firstLine="709"/>
-        <w:jc w:val="both"/>
-        <w:rPr>
-          <w:rFonts w:ascii="Times New Roman" w:hAnsi="Times New Roman" w:cs="Times New Roman"/>
-          <w:sz w:val="28"/>
-          <w:szCs w:val="28"/>
-        </w:rPr>
-      </w:pPr>
-      <w:r>
-        <w:rPr>
-          <w:rFonts w:ascii="Times New Roman" w:hAnsi="Times New Roman" w:cs="Times New Roman"/>
-          <w:sz w:val="28"/>
-          <w:szCs w:val="28"/>
-        </w:rPr>
-        <w:t>Задачи системы безопасности информации направлены на обеспечение комплексной защиты данных и информационных ресурсов от различных внутренних и внешних угроз. В основе таких задач лежат три ключевых компонента: конфиденциальность, целостность и доступность информации. Конфиденциальность предполагает предотвращение несанкционированного доступа к данным, что обеспечивает защиту персональной и коммерческой информации от утечек и злоупотреблений. Целостность направлена на сохранение точности и полноты информации, исключая её искажение или подделку. Доступность гарантирует, что пользователи смогут получить необходимую информацию и ресурсы без помех в нужное время.</w:t>
-      </w:r>
-    </w:p>
-    <w:p>
-      <w:pPr>
-        <w:ind w:firstLine="709"/>
-        <w:jc w:val="both"/>
-        <w:rPr>
-          <w:rFonts w:ascii="Times New Roman" w:hAnsi="Times New Roman" w:cs="Times New Roman"/>
-          <w:sz w:val="28"/>
-          <w:szCs w:val="28"/>
-        </w:rPr>
-      </w:pPr>
-      <w:r>
-        <w:rPr>
-          <w:rFonts w:ascii="Times New Roman" w:hAnsi="Times New Roman" w:cs="Times New Roman"/>
-          <w:sz w:val="28"/>
-          <w:szCs w:val="28"/>
-        </w:rPr>
-        <w:t xml:space="preserve">Кроме этих базовых аспектов, система безопасности решает задачи своевременного обнаружения и реагирования на угрозы, что включает мониторинг событий безопасности и проведение аудита для выявления </w:t>
-      </w:r>
-      <w:r>
-        <w:rPr>
-          <w:rFonts w:ascii="Times New Roman" w:hAnsi="Times New Roman" w:cs="Times New Roman"/>
-          <w:sz w:val="28"/>
-          <w:szCs w:val="28"/>
-        </w:rPr>
-        <w:lastRenderedPageBreak/>
-        <w:t>попыток несанкционированного доступа или сбоев. Управление рисками играет важную роль — это постоянный процесс оценки угроз и внедрения мер по их минимизации, что снижает вероятность инцидентов и их последствия. Также значимой задачей является обеспечение непрерывности бизнес-процессов через защиту от сбоев и резервное копирование данных.</w:t>
-      </w:r>
-    </w:p>
-    <w:p>
-      <w:pPr>
-        <w:ind w:firstLine="709"/>
-        <w:jc w:val="both"/>
-        <w:rPr>
-          <w:rFonts w:ascii="Times New Roman" w:hAnsi="Times New Roman" w:cs="Times New Roman"/>
-          <w:sz w:val="28"/>
-          <w:szCs w:val="28"/>
-        </w:rPr>
-      </w:pPr>
-      <w:r>
-        <w:rPr>
-          <w:rFonts w:ascii="Times New Roman" w:hAnsi="Times New Roman" w:cs="Times New Roman"/>
-          <w:sz w:val="28"/>
-          <w:szCs w:val="28"/>
-        </w:rPr>
-        <w:t>Неотъемлемой частью системы безопасности является и формирование политики безопасности, обучение сотрудников и создание культуры информационной безопасности в организации. Это помогает снизить риски, связанные с человеческим фактором, и обеспечивает системный подход к защите информации. В итоге, задачи системы безопасности выполняют важную функцию поддержки устойчивости и надежности информационных систем, а также соблюдения требований законодательства и стандартов безопасности.</w:t>
-      </w:r>
-    </w:p>
-    <w:p>
-      <w:pPr>
-        <w:ind w:firstLine="709"/>
-        <w:jc w:val="both"/>
-        <w:rPr>
-          <w:rFonts w:ascii="Times New Roman" w:hAnsi="Times New Roman" w:cs="Times New Roman"/>
-          <w:sz w:val="28"/>
-          <w:szCs w:val="28"/>
-        </w:rPr>
-      </w:pPr>
-      <w:r>
-        <w:rPr>
-          <w:rFonts w:ascii="Times New Roman" w:hAnsi="Times New Roman" w:cs="Times New Roman"/>
-          <w:sz w:val="28"/>
-          <w:szCs w:val="28"/>
-        </w:rPr>
-        <w:t>7. Меры противодействия угрозам безопасности. Классификация мер.</w:t>
-      </w:r>
-    </w:p>
-    <w:p>
-      <w:pPr>
-        <w:ind w:firstLine="709"/>
-        <w:jc w:val="both"/>
-        <w:rPr>
-          <w:rFonts w:ascii="Times New Roman" w:hAnsi="Times New Roman" w:cs="Times New Roman"/>
-          <w:sz w:val="28"/>
-          <w:szCs w:val="28"/>
-        </w:rPr>
-      </w:pPr>
-      <w:r>
-        <w:rPr>
-          <w:rFonts w:ascii="Times New Roman" w:hAnsi="Times New Roman" w:cs="Times New Roman"/>
-          <w:sz w:val="28"/>
-          <w:szCs w:val="28"/>
-        </w:rPr>
-        <w:t>Меры противодействия угрозам безопасности можно классифицировать по различным критериям, что помогает комплексно и эффективно защищать информационные системы. В зависимости от способа реализации меры делятся на правовые (законодательные), организационные, технические, программно-аппаратные и физические. Правовые меры включают нормативные документы, регламенты и санкции, которые регулируют поведение пользователей и создают правовую основу для защиты информации. Организационные меры ориентированы на формирование политики безопасности, обучение персонала, контроль процедур и распределение ответственности.</w:t>
-      </w:r>
-    </w:p>
-    <w:p>
-      <w:pPr>
-        <w:ind w:firstLine="709"/>
-        <w:jc w:val="both"/>
-        <w:rPr>
-          <w:rFonts w:ascii="Times New Roman" w:hAnsi="Times New Roman" w:cs="Times New Roman"/>
-          <w:sz w:val="28"/>
-          <w:szCs w:val="28"/>
-        </w:rPr>
-      </w:pPr>
-      <w:r>
-        <w:rPr>
-          <w:rFonts w:ascii="Times New Roman" w:hAnsi="Times New Roman" w:cs="Times New Roman"/>
-          <w:sz w:val="28"/>
-          <w:szCs w:val="28"/>
-        </w:rPr>
-        <w:t>Технические и программно-аппаратные меры направлены непосредственно на защиту систем при помощи специализированных средств. К ним относятся технологии шифрования, системы контроля доступа, антивирусное программное обеспечение, межсетевые экраны и средства обнаружения атак. Физические меры обеспечивают защиту оборудования и помещений, в которых расположены информационные системы, с помощью контроля доступа, охранной сигнализации и видеонаблюдения. Такой комплексный подход позволяет снизить риски и минимизировать ущерб от инцидентов.</w:t>
-      </w:r>
-    </w:p>
-    <w:p>
-      <w:pPr>
-        <w:ind w:firstLine="709"/>
-        <w:jc w:val="both"/>
-        <w:rPr>
-          <w:rFonts w:ascii="Times New Roman" w:hAnsi="Times New Roman" w:cs="Times New Roman"/>
-          <w:sz w:val="28"/>
-          <w:szCs w:val="28"/>
-        </w:rPr>
-      </w:pPr>
-      <w:r>
-        <w:rPr>
-          <w:rFonts w:ascii="Times New Roman" w:hAnsi="Times New Roman" w:cs="Times New Roman"/>
-          <w:sz w:val="28"/>
-          <w:szCs w:val="28"/>
-        </w:rPr>
-        <w:t xml:space="preserve">Классификация мер противодействия важна для системного построения защиты, поскольку каждая категория решает разные аспекты безопасности и воздействует на угрозы с разных сторон. Правовые и организационные меры создают основу и правила, технические и программные – реализуют в техническом плане, а физические препятствуют физическому несанкционированному доступу. Только сбалансированное сочетание всех </w:t>
-      </w:r>
-      <w:r>
-        <w:rPr>
-          <w:rFonts w:ascii="Times New Roman" w:hAnsi="Times New Roman" w:cs="Times New Roman"/>
-          <w:sz w:val="28"/>
-          <w:szCs w:val="28"/>
-        </w:rPr>
-        <w:lastRenderedPageBreak/>
-        <w:t>типов мер обеспечит высокую степень защиты информации и устойчивость работы информационных систем.</w:t>
-      </w:r>
-    </w:p>
-    <w:p>
-      <w:pPr>
-        <w:ind w:firstLine="709"/>
-        <w:jc w:val="both"/>
-        <w:rPr>
-          <w:rFonts w:ascii="Times New Roman" w:hAnsi="Times New Roman" w:cs="Times New Roman"/>
-          <w:sz w:val="28"/>
-          <w:szCs w:val="28"/>
-        </w:rPr>
-      </w:pPr>
-      <w:r>
-        <w:rPr>
-          <w:rFonts w:ascii="Times New Roman" w:hAnsi="Times New Roman" w:cs="Times New Roman"/>
-          <w:sz w:val="28"/>
-          <w:szCs w:val="28"/>
-        </w:rPr>
-        <w:t>8. Основные нормативные руководящие документы, касающиеся государственной тайны, нормативно-справочные документы.</w:t>
-      </w:r>
-    </w:p>
-    <w:p>
-      <w:pPr>
-        <w:ind w:firstLine="709"/>
-        <w:jc w:val="both"/>
-        <w:rPr>
-          <w:rFonts w:ascii="Times New Roman" w:hAnsi="Times New Roman" w:cs="Times New Roman"/>
-          <w:sz w:val="28"/>
-          <w:szCs w:val="28"/>
-        </w:rPr>
-      </w:pPr>
-      <w:r>
-        <w:rPr>
-          <w:rFonts w:ascii="Times New Roman" w:hAnsi="Times New Roman" w:cs="Times New Roman"/>
-          <w:sz w:val="28"/>
-          <w:szCs w:val="28"/>
-        </w:rPr>
-        <w:t>Основными нормативными руководящими документами, касающимися государственной тайны, является Федеральный закон от 21 июля 1993 года № 5485-1 «О государственной тайне». Этот закон регулирует вопросы отнесения сведений к государственной тайне, их засекречивания, защиты и контроля распространения, а также определяет права и обязанности государственных органов и граждан в сфере защиты таких сведений. Кроме того, закон устанавливает понятия, связанные с государственной тайной, и определяет перечень сведений, подлежащих засекречиванию.</w:t>
-      </w:r>
-    </w:p>
-    <w:p>
-      <w:pPr>
-        <w:ind w:firstLine="709"/>
-        <w:jc w:val="both"/>
-        <w:rPr>
-          <w:rFonts w:ascii="Times New Roman" w:hAnsi="Times New Roman" w:cs="Times New Roman"/>
-          <w:sz w:val="28"/>
-          <w:szCs w:val="28"/>
-        </w:rPr>
-      </w:pPr>
-      <w:r>
-        <w:rPr>
-          <w:rFonts w:ascii="Times New Roman" w:hAnsi="Times New Roman" w:cs="Times New Roman"/>
-          <w:sz w:val="28"/>
-          <w:szCs w:val="28"/>
-        </w:rPr>
-        <w:t>Важным нормативным актом является Указ Президента РФ от 30 ноября 1995 года № 1203 «Об утверждении Перечня сведений, отнесенных к государственной тайне», в котором детально перечисляются сведения, охраняемые государством. Этот документ обеспечивает основу для систематизации и упорядочивания информации, которая требует особой защиты. Помимо этого, существуют специальные подзаконные акты, ведомственные инструкции и стандарты, определяющие правила допуска к государственной тайне, порядок её защиты, аттестацию объектов информатизации и меры безопасности.</w:t>
-      </w:r>
-    </w:p>
-    <w:p>
-      <w:pPr>
-        <w:ind w:firstLine="709"/>
-        <w:jc w:val="both"/>
-        <w:rPr>
-          <w:rFonts w:ascii="Times New Roman" w:hAnsi="Times New Roman" w:cs="Times New Roman"/>
-          <w:sz w:val="28"/>
-          <w:szCs w:val="28"/>
-        </w:rPr>
-      </w:pPr>
-      <w:r>
-        <w:rPr>
-          <w:rFonts w:ascii="Times New Roman" w:hAnsi="Times New Roman" w:cs="Times New Roman"/>
-          <w:sz w:val="28"/>
-          <w:szCs w:val="28"/>
-        </w:rPr>
-        <w:t>Федеральная служба безопасности (ФСБ) России играет ключевую роль в контроле и обеспечении защиты государственной тайны. Она регулирует вопросы допусков к тайным сведениям, проводит проверки и осуществляет надзор за исполнением требований законодательства. Для организаций, работающих с государственными тайнами, предусмотрены процедуры аттестации информационных систем, физической и технической защиты объектов, а также специальные требования к работникам, имеющим доступ к секретной информации. Эти документы и нормы создают комплексную правовую и технологическую базу для защиты государственных интересов и безопасности страны.</w:t>
-      </w:r>
-    </w:p>
-    <w:p>
-      <w:pPr>
-        <w:ind w:firstLine="709"/>
-        <w:jc w:val="both"/>
-        <w:rPr>
-          <w:rFonts w:ascii="Times New Roman" w:hAnsi="Times New Roman" w:cs="Times New Roman"/>
-          <w:sz w:val="28"/>
-          <w:szCs w:val="28"/>
-        </w:rPr>
-      </w:pPr>
-      <w:r>
-        <w:rPr>
-          <w:rFonts w:ascii="Times New Roman" w:hAnsi="Times New Roman" w:cs="Times New Roman"/>
-          <w:sz w:val="28"/>
-          <w:szCs w:val="28"/>
-        </w:rPr>
-        <w:t>9. Основные механизмы защиты АС.</w:t>
-      </w:r>
-    </w:p>
-    <w:p>
-      <w:pPr>
-        <w:ind w:firstLine="709"/>
-        <w:jc w:val="both"/>
-        <w:rPr>
-          <w:rFonts w:ascii="Times New Roman" w:hAnsi="Times New Roman" w:cs="Times New Roman"/>
-          <w:sz w:val="28"/>
-          <w:szCs w:val="28"/>
-        </w:rPr>
-      </w:pPr>
-      <w:r>
-        <w:rPr>
-          <w:rFonts w:ascii="Times New Roman" w:hAnsi="Times New Roman" w:cs="Times New Roman"/>
-          <w:sz w:val="28"/>
-          <w:szCs w:val="28"/>
-        </w:rPr>
-        <w:t xml:space="preserve">Основные механизмы защиты автоматизированных систем (АС) включают совокупность технических, программных и организационных средств, направленных на предотвращение несанкционированного доступа, обеспечение целостности и конфиденциальности данных, а также поддержание доступности сервисов. К ключевым механизмам относятся идентификация и аутентификация пользователей, которые подтверждают право доступа к системе. Помимо этого, важен контроль разграничения </w:t>
-      </w:r>
-      <w:r>
-        <w:rPr>
-          <w:rFonts w:ascii="Times New Roman" w:hAnsi="Times New Roman" w:cs="Times New Roman"/>
-          <w:sz w:val="28"/>
-          <w:szCs w:val="28"/>
-        </w:rPr>
-        <w:lastRenderedPageBreak/>
-        <w:t>доступа, который позволяет ограничить возможности пользователей в зависимости от их ролей и полномочий.</w:t>
-      </w:r>
-    </w:p>
-    <w:p>
-      <w:pPr>
-        <w:ind w:firstLine="709"/>
-        <w:jc w:val="both"/>
-        <w:rPr>
-          <w:rFonts w:ascii="Times New Roman" w:hAnsi="Times New Roman" w:cs="Times New Roman"/>
-          <w:sz w:val="28"/>
-          <w:szCs w:val="28"/>
-        </w:rPr>
-      </w:pPr>
-      <w:r>
-        <w:rPr>
-          <w:rFonts w:ascii="Times New Roman" w:hAnsi="Times New Roman" w:cs="Times New Roman"/>
-          <w:sz w:val="28"/>
-          <w:szCs w:val="28"/>
-        </w:rPr>
-        <w:t>Другой важный механизм — защита от вредоносного кода с помощью антивирусного программного обеспечения и систем обнаружения вторжений (IDS/IPS). Также применяются средства шифрования данных, которые защищают информацию при передаче и хранении от перехвата и несанкционированного раскрытия. В состав защиты входят системы протоколирования и аудита, фиксирующие события безопасности для анализа и быстрого реагирования на инциденты.</w:t>
-      </w:r>
-    </w:p>
-    <w:p>
-      <w:pPr>
-        <w:ind w:firstLine="709"/>
-        <w:jc w:val="both"/>
-        <w:rPr>
-          <w:rFonts w:ascii="Times New Roman" w:hAnsi="Times New Roman" w:cs="Times New Roman"/>
-          <w:sz w:val="28"/>
-          <w:szCs w:val="28"/>
-        </w:rPr>
-      </w:pPr>
-      <w:r>
-        <w:rPr>
-          <w:rFonts w:ascii="Times New Roman" w:hAnsi="Times New Roman" w:cs="Times New Roman"/>
-          <w:sz w:val="28"/>
-          <w:szCs w:val="28"/>
-        </w:rPr>
-        <w:t>Не менее значимы меры резервирования и копирования данных, обеспечивающие восстановление информации при технических сбоях или авариях. Физическая защита оборудования и контроль доступа к помещениям составляют дополнительные барьеры для предотвращения внешних и внутренних угроз. Современные АС часто используют комплексные решения, включая DLP- и SIEM-системы, которые автоматизируют мониторинг, анализ и реагирование на угрозы, повышая общую эффективность защиты.</w:t>
-      </w:r>
-    </w:p>
-    <w:p>
-      <w:pPr>
-        <w:ind w:firstLine="709"/>
-        <w:jc w:val="both"/>
-        <w:rPr>
-          <w:rFonts w:ascii="Times New Roman" w:hAnsi="Times New Roman" w:cs="Times New Roman"/>
-          <w:sz w:val="28"/>
-          <w:szCs w:val="28"/>
-        </w:rPr>
-      </w:pPr>
-      <w:r>
-        <w:rPr>
-          <w:rFonts w:ascii="Times New Roman" w:hAnsi="Times New Roman" w:cs="Times New Roman"/>
-          <w:sz w:val="28"/>
-          <w:szCs w:val="28"/>
-        </w:rPr>
-        <w:t>10. Модели безопасности и их применение.</w:t>
-      </w:r>
-    </w:p>
-    <w:p>
-      <w:pPr>
-        <w:ind w:firstLine="709"/>
-        <w:jc w:val="both"/>
-        <w:rPr>
-          <w:rFonts w:ascii="Times New Roman" w:hAnsi="Times New Roman" w:cs="Times New Roman"/>
-          <w:sz w:val="28"/>
-          <w:szCs w:val="28"/>
-        </w:rPr>
-      </w:pPr>
-      <w:r>
-        <w:rPr>
-          <w:rFonts w:ascii="Times New Roman" w:hAnsi="Times New Roman" w:cs="Times New Roman"/>
-          <w:sz w:val="28"/>
-          <w:szCs w:val="28"/>
-        </w:rPr>
-        <w:t>Модели безопасности представляют собой теоретические и практические подходы, применяемые для определения и реализации политики защиты информации в автоматизированных системах (АС). Они обеспечивают формализацию методов предотвращения угроз, таких как раскрытие, изменение или уничтожение данных, а также контроль доступа. В современном подходе выделяют концептуальные, математические и функциональные модели, каждая из которых использует разные алгоритмы и принципы для построения системы защиты.</w:t>
-      </w:r>
-    </w:p>
-    <w:p>
-      <w:pPr>
-        <w:ind w:firstLine="709"/>
-        <w:jc w:val="both"/>
-        <w:rPr>
-          <w:rFonts w:ascii="Times New Roman" w:hAnsi="Times New Roman" w:cs="Times New Roman"/>
-          <w:sz w:val="28"/>
-          <w:szCs w:val="28"/>
-        </w:rPr>
-      </w:pPr>
-      <w:r>
-        <w:rPr>
-          <w:rFonts w:ascii="Times New Roman" w:hAnsi="Times New Roman" w:cs="Times New Roman"/>
-          <w:sz w:val="28"/>
-          <w:szCs w:val="28"/>
-        </w:rPr>
-        <w:t>Одним из распространенных подходов является модель разграничения доступа, которая включает дискретные (DAC) и мандатные (MAC) модели. Они позволяют определить права и ограничения пользователей на уровне отдельных объектов или по ролям, что способствует формированию надежной политики безопасности. Также широко используются модели, основанные на криптографических алгоритмах, а также модели, реализующие принцип безопасности на основе теории вероятности и информации — например, модели, оценивающие уровень защиты системы по степени риска и сложности возможных атак.</w:t>
-      </w:r>
-    </w:p>
-    <w:p>
-      <w:pPr>
-        <w:ind w:firstLine="709"/>
-        <w:jc w:val="both"/>
-        <w:rPr>
-          <w:rFonts w:ascii="Times New Roman" w:hAnsi="Times New Roman" w:cs="Times New Roman"/>
-          <w:sz w:val="28"/>
-          <w:szCs w:val="28"/>
-        </w:rPr>
-      </w:pPr>
-      <w:r>
-        <w:rPr>
-          <w:rFonts w:ascii="Times New Roman" w:hAnsi="Times New Roman" w:cs="Times New Roman"/>
-          <w:sz w:val="28"/>
-          <w:szCs w:val="28"/>
-        </w:rPr>
-        <w:t xml:space="preserve">Кроме того, существует классификация моделей по степени их эффективности и области применения: модели предотвращения раскрытия информации, обеспечения целостности и отказоустойчивости. Важную роль играют также модели оценки уровня защищенности, которая помогает определить класс системы и выбрать соответствующие меры защиты. Такой </w:t>
-      </w:r>
-      <w:r>
-        <w:rPr>
-          <w:rFonts w:ascii="Times New Roman" w:hAnsi="Times New Roman" w:cs="Times New Roman"/>
-          <w:sz w:val="28"/>
-          <w:szCs w:val="28"/>
-        </w:rPr>
-        <w:lastRenderedPageBreak/>
-        <w:t>системный подход позволяет адаптировать модель безопасности под конкретные задачи организации и обеспечить оптимальный уровень защиты данных и ресурсов.</w:t>
-      </w:r>
-    </w:p>
-    <w:p>
-      <w:pPr>
-        <w:ind w:firstLine="709"/>
-        <w:jc w:val="both"/>
-        <w:rPr>
-          <w:rFonts w:ascii="Times New Roman" w:hAnsi="Times New Roman" w:cs="Times New Roman"/>
-          <w:sz w:val="28"/>
-          <w:szCs w:val="28"/>
-        </w:rPr>
-      </w:pPr>
-      <w:r>
-        <w:rPr>
-          <w:rFonts w:ascii="Times New Roman" w:hAnsi="Times New Roman" w:cs="Times New Roman"/>
-          <w:sz w:val="28"/>
-          <w:szCs w:val="28"/>
-        </w:rPr>
-        <w:t>11. ISO/IEC 27001:2005 и ГОСТ Р ИСО/МЭК 27001–2006 – требования к СУИБ.</w:t>
-      </w:r>
-    </w:p>
-    <w:p>
-      <w:pPr>
-        <w:ind w:firstLine="709"/>
-        <w:jc w:val="both"/>
-        <w:rPr>
-          <w:rFonts w:ascii="Times New Roman" w:hAnsi="Times New Roman" w:cs="Times New Roman"/>
-          <w:sz w:val="28"/>
-          <w:szCs w:val="28"/>
-        </w:rPr>
-      </w:pPr>
-      <w:r>
-        <w:rPr>
-          <w:rFonts w:ascii="Times New Roman" w:hAnsi="Times New Roman" w:cs="Times New Roman"/>
-          <w:sz w:val="28"/>
-          <w:szCs w:val="28"/>
-        </w:rPr>
-        <w:t>ISO/IEC 27001:2005 и ГОСТ Р ИСО/МЭК 27001–2006 представляют собой стандарты, которые устанавливают требования к системе менеджмента информационной безопасности (СУИБ). Эти стандарты ориентированы на создание, внедрение, функционирование, мониторинг, анализ, поддержку и непрерывное улучшение СУИБ в организациях любого масштаба и сферы деятельности. Главной целью этих стандартов является обеспечение комплексного управления рисками информационной безопасности и защита активов компании от угроз и уязвимостей.</w:t>
-      </w:r>
-    </w:p>
-    <w:p>
-      <w:pPr>
-        <w:ind w:firstLine="709"/>
-        <w:jc w:val="both"/>
-        <w:rPr>
-          <w:rFonts w:ascii="Times New Roman" w:hAnsi="Times New Roman" w:cs="Times New Roman"/>
-          <w:sz w:val="28"/>
-          <w:szCs w:val="28"/>
-        </w:rPr>
-      </w:pPr>
-      <w:r>
-        <w:rPr>
-          <w:rFonts w:ascii="Times New Roman" w:hAnsi="Times New Roman" w:cs="Times New Roman"/>
-          <w:sz w:val="28"/>
-          <w:szCs w:val="28"/>
-        </w:rPr>
-        <w:t>Стандарты задают процессный подход к управлению информационной безопасностью, включая формулирование политики безопасности, оценку и управление рисками, определение ответственности, контроль изменений, а также внутренние аудиты и пересмотр системы. Важным аспектом является определение области действия СУИБ с четким документированием границ и рассматриваемых активов. Также стандарты предусматривают внедрение соответствующих мер защиты, обучение персонала и регулярный аудит, что позволяет поддерживать высокий уровень защиты и соответствие законодательным и нормативным требованиям.</w:t>
-      </w:r>
-    </w:p>
-    <w:p>
-      <w:pPr>
-        <w:ind w:firstLine="709"/>
-        <w:jc w:val="both"/>
-        <w:rPr>
-          <w:rFonts w:ascii="Times New Roman" w:hAnsi="Times New Roman" w:cs="Times New Roman"/>
-          <w:sz w:val="28"/>
-          <w:szCs w:val="28"/>
-        </w:rPr>
-      </w:pPr>
-      <w:r>
-        <w:rPr>
-          <w:rFonts w:ascii="Times New Roman" w:hAnsi="Times New Roman" w:cs="Times New Roman"/>
-          <w:sz w:val="28"/>
-          <w:szCs w:val="28"/>
-        </w:rPr>
-        <w:t>Внедрение ГОСТ Р ИСО/МЭК 27001–2006 помогает организациям повысить доверие клиентов и партнеров, укрепить деловые отношения и снизить риски инцидентов информационной безопасности. Сертификация по этому стандарту подтверждает надежность и зрелость системы управления ИБ, способствует минимизации штрафов за нарушение законодательства, например, в области персональных данных, и поддерживает устойчивость бизнес-процессов. Таким образом, соблюдение требований этих стандартов является важным элементом стратегического развития и укрепления позиций компании на рынке.</w:t>
-      </w:r>
-    </w:p>
-    <w:p>
-      <w:pPr>
-        <w:ind w:firstLine="709"/>
-        <w:jc w:val="both"/>
-        <w:rPr>
-          <w:rFonts w:ascii="Times New Roman" w:hAnsi="Times New Roman" w:cs="Times New Roman"/>
-          <w:sz w:val="28"/>
-          <w:szCs w:val="28"/>
-        </w:rPr>
-      </w:pPr>
-      <w:r>
-        <w:rPr>
-          <w:rFonts w:ascii="Times New Roman" w:hAnsi="Times New Roman" w:cs="Times New Roman"/>
-          <w:sz w:val="28"/>
-          <w:szCs w:val="28"/>
-        </w:rPr>
-        <w:t>12. ISO/IEC 27002:2005 и ГОСТ Р ИСО/МЭК 17799–2005 – практические правила управления ИБ.</w:t>
-      </w:r>
-    </w:p>
-    <w:p>
-      <w:pPr>
-        <w:ind w:firstLine="709"/>
-        <w:jc w:val="both"/>
-        <w:rPr>
-          <w:rFonts w:ascii="Times New Roman" w:hAnsi="Times New Roman" w:cs="Times New Roman"/>
-          <w:sz w:val="28"/>
-          <w:szCs w:val="28"/>
-        </w:rPr>
-      </w:pPr>
-      <w:r>
-        <w:rPr>
-          <w:rFonts w:ascii="Times New Roman" w:hAnsi="Times New Roman" w:cs="Times New Roman"/>
-          <w:sz w:val="28"/>
-          <w:szCs w:val="28"/>
-        </w:rPr>
-        <w:t xml:space="preserve">ISO/IEC 27002:2005 и ГОСТ Р ИСО/МЭК 17799–2005 представляют собой стандарты, содержащие практические правила и рекомендации по управлению информационной безопасностью. Эти документы служат руководством по выбору и внедрению мер безопасности, основываясь на лучших мировых практиках. Основное отличие состоит в том, что ISO/IEC 27001 устанавливает требования к системе менеджмента информационной </w:t>
-      </w:r>
-      <w:r>
-        <w:rPr>
-          <w:rFonts w:ascii="Times New Roman" w:hAnsi="Times New Roman" w:cs="Times New Roman"/>
-          <w:sz w:val="28"/>
-          <w:szCs w:val="28"/>
-        </w:rPr>
-        <w:lastRenderedPageBreak/>
-        <w:t>безопасности (СУИБ), а ISO/IEC 27002 (ранее известный как ISO/IEC 17799) предлагает детализированный набор контролей и процедур для реализации этих требований.</w:t>
-      </w:r>
-    </w:p>
-    <w:p>
-      <w:pPr>
-        <w:ind w:firstLine="709"/>
-        <w:jc w:val="both"/>
-        <w:rPr>
-          <w:rFonts w:ascii="Times New Roman" w:hAnsi="Times New Roman" w:cs="Times New Roman"/>
-          <w:sz w:val="28"/>
-          <w:szCs w:val="28"/>
-        </w:rPr>
-      </w:pPr>
-      <w:r>
-        <w:rPr>
-          <w:rFonts w:ascii="Times New Roman" w:hAnsi="Times New Roman" w:cs="Times New Roman"/>
-          <w:sz w:val="28"/>
-          <w:szCs w:val="28"/>
-        </w:rPr>
-        <w:t>ГОСТ Р ИСО/МЭК 17799–2005 полностью соответствует структуре и содержанию ISO/IEC 27002:2005 и предлагает практические рекомендации по таким аспектам, как управление активами, контроль доступа, криптографические меры, управление инцидентами безопасности, резервное копирование и физическая защита. Стандарт описывает 11 доменов безопасности, в которых сгруппированы меры контроля, и предоставляет конкретные методы их внедрения в организацию, что помогает формировать эффективную систему защиты информации.</w:t>
-      </w:r>
-    </w:p>
-    <w:p>
-      <w:pPr>
-        <w:ind w:firstLine="709"/>
-        <w:jc w:val="both"/>
-        <w:rPr>
-          <w:rFonts w:ascii="Times New Roman" w:hAnsi="Times New Roman" w:cs="Times New Roman"/>
-          <w:sz w:val="28"/>
-          <w:szCs w:val="28"/>
-        </w:rPr>
-      </w:pPr>
-      <w:r>
-        <w:rPr>
-          <w:rFonts w:ascii="Times New Roman" w:hAnsi="Times New Roman" w:cs="Times New Roman"/>
-          <w:sz w:val="28"/>
-          <w:szCs w:val="28"/>
-        </w:rPr>
-        <w:t>Современный подход к управлению ИБ подразумевает интеграцию ISO/IEC 27002 в процессы компании для повышения уровня безопасности и снижения рисков. Это позволяет организациям не только соответствовать требованиям законодательства и нормативам, но и улучшить репутацию, повысить доверие клиентов и партнеров. Важно отметить, что стандарты постоянно обновляются, чтобы учитывать новые угрозы и технологии, и успешное их применение требует регулярного пересмотра и адаптации мер безопасности.</w:t>
-      </w:r>
-    </w:p>
-    <w:p>
-      <w:pPr>
-        <w:ind w:firstLine="709"/>
-        <w:jc w:val="both"/>
-        <w:rPr>
-          <w:rFonts w:ascii="Times New Roman" w:hAnsi="Times New Roman" w:cs="Times New Roman"/>
-          <w:sz w:val="28"/>
-          <w:szCs w:val="28"/>
-        </w:rPr>
-      </w:pPr>
-      <w:r>
-        <w:rPr>
-          <w:rFonts w:ascii="Times New Roman" w:hAnsi="Times New Roman" w:cs="Times New Roman"/>
-          <w:sz w:val="28"/>
-          <w:szCs w:val="28"/>
-        </w:rPr>
-        <w:t>13. ISO/IEC 27003:2010 – руководство по внедрению СУИБ.</w:t>
-      </w:r>
-    </w:p>
-    <w:p>
-      <w:pPr>
-        <w:ind w:firstLine="709"/>
-        <w:jc w:val="both"/>
-        <w:rPr>
-          <w:rFonts w:ascii="Times New Roman" w:hAnsi="Times New Roman" w:cs="Times New Roman"/>
-          <w:sz w:val="28"/>
-          <w:szCs w:val="28"/>
-        </w:rPr>
-      </w:pPr>
-      <w:r>
-        <w:rPr>
-          <w:rFonts w:ascii="Times New Roman" w:hAnsi="Times New Roman" w:cs="Times New Roman"/>
-          <w:sz w:val="28"/>
-          <w:szCs w:val="28"/>
-        </w:rPr>
-        <w:t>ISO/IEC 27003:2010 — это международный стандарт, представляющий собой руководство по внедрению системы управления информационной безопасностью (СУИБ). Он адресован организациям, которые планируют разработать и внедрить СУИБ в соответствии с требованиями ISO/IEC 27001:2005. Стандарт описывает весь процесс внедрения — от получения поддержки руководства и определения области применения до планирования реализации и разработки необходимых документов и процедур.</w:t>
-      </w:r>
-    </w:p>
-    <w:p>
-      <w:pPr>
-        <w:ind w:firstLine="709"/>
-        <w:jc w:val="both"/>
-        <w:rPr>
-          <w:rFonts w:ascii="Times New Roman" w:hAnsi="Times New Roman" w:cs="Times New Roman"/>
-          <w:sz w:val="28"/>
-          <w:szCs w:val="28"/>
-        </w:rPr>
-      </w:pPr>
-      <w:r>
-        <w:rPr>
-          <w:rFonts w:ascii="Times New Roman" w:hAnsi="Times New Roman" w:cs="Times New Roman"/>
-          <w:sz w:val="28"/>
-          <w:szCs w:val="28"/>
-        </w:rPr>
-        <w:t>Документ структурирован вокруг пяти ключевых фаз внедрения СУИБ: получение одобрения руководства, определение области действия и политики безопасности, анализ организации, проведение оценки рисков и разработка плана обработки рисков, а также создание и внедрение самой системы управления. ISO/IEC 27003 уделяет внимание детализации этапов, которые помогают обеспечить согласованность всех действий и эффективное управление проектом внедрения.</w:t>
-      </w:r>
-    </w:p>
-    <w:p>
-      <w:pPr>
-        <w:ind w:firstLine="709"/>
-        <w:jc w:val="both"/>
-        <w:rPr>
-          <w:rFonts w:ascii="Times New Roman" w:hAnsi="Times New Roman" w:cs="Times New Roman"/>
-          <w:sz w:val="28"/>
-          <w:szCs w:val="28"/>
-        </w:rPr>
-      </w:pPr>
-      <w:r>
-        <w:rPr>
-          <w:rFonts w:ascii="Times New Roman" w:hAnsi="Times New Roman" w:cs="Times New Roman"/>
-          <w:sz w:val="28"/>
-          <w:szCs w:val="28"/>
-        </w:rPr>
-        <w:t xml:space="preserve">Кроме того, стандарт содержит рекомендации по распределению ролей и ответственности, описанию политик, подготовке к аудиту и созданию системы мониторинга эффективности работы СУИБ. В совокупности эти меры помогают организациям не только формализовать процесс управления информационной безопасностью, но и поддерживать и улучшать систему на </w:t>
-      </w:r>
-      <w:r>
-        <w:rPr>
-          <w:rFonts w:ascii="Times New Roman" w:hAnsi="Times New Roman" w:cs="Times New Roman"/>
-          <w:sz w:val="28"/>
-          <w:szCs w:val="28"/>
-        </w:rPr>
-        <w:lastRenderedPageBreak/>
-        <w:t>постоянной основе, обеспечивая защиту бизнес-активов и соответствие нормативным требованиям.</w:t>
-      </w:r>
-    </w:p>
-    <w:p>
-      <w:pPr>
-        <w:ind w:firstLine="709"/>
-        <w:jc w:val="both"/>
-        <w:rPr>
-          <w:rFonts w:ascii="Times New Roman" w:hAnsi="Times New Roman" w:cs="Times New Roman"/>
-          <w:sz w:val="28"/>
-          <w:szCs w:val="28"/>
-        </w:rPr>
-      </w:pPr>
-      <w:r>
-        <w:rPr>
-          <w:rFonts w:ascii="Times New Roman" w:hAnsi="Times New Roman" w:cs="Times New Roman"/>
-          <w:sz w:val="28"/>
-          <w:szCs w:val="28"/>
-        </w:rPr>
-        <w:t>14. ISO/IEC 27004:2009 и ГОСТ Р ИСО/МЭК 27004–2011 – оценка функционирования СУИБ.</w:t>
-      </w:r>
-    </w:p>
-    <w:p>
-      <w:pPr>
-        <w:ind w:firstLine="709"/>
-        <w:jc w:val="both"/>
-        <w:rPr>
-          <w:rFonts w:ascii="Times New Roman" w:hAnsi="Times New Roman" w:cs="Times New Roman"/>
-          <w:sz w:val="28"/>
-          <w:szCs w:val="28"/>
-        </w:rPr>
-      </w:pPr>
-      <w:r>
-        <w:rPr>
-          <w:rFonts w:ascii="Times New Roman" w:hAnsi="Times New Roman" w:cs="Times New Roman"/>
-          <w:sz w:val="28"/>
-          <w:szCs w:val="28"/>
-        </w:rPr>
-        <w:t>ISO/IEC 27004:2009 и ГОСТ Р ИСО/МЭК 27004–2011 являются стандартами, ориентированными на оценку эффективности функционирования системы управления информационной безопасностью (СУИБ). Они предоставляют рекомендации по разработке и использованию измерений и метрик, которые позволяют объективно оценивать, насколько реализованная СУИБ соответствует поставленным целям и требованиям. Благодаря этим стандартам организации могут получать достоверную информацию о состоянии безопасности и принимать обоснованные решения для совершенствования системы.</w:t>
-      </w:r>
-    </w:p>
-    <w:p>
-      <w:pPr>
-        <w:ind w:firstLine="709"/>
-        <w:jc w:val="both"/>
-        <w:rPr>
-          <w:rFonts w:ascii="Times New Roman" w:hAnsi="Times New Roman" w:cs="Times New Roman"/>
-          <w:sz w:val="28"/>
-          <w:szCs w:val="28"/>
-        </w:rPr>
-      </w:pPr>
-      <w:r>
-        <w:rPr>
-          <w:rFonts w:ascii="Times New Roman" w:hAnsi="Times New Roman" w:cs="Times New Roman"/>
-          <w:sz w:val="28"/>
-          <w:szCs w:val="28"/>
-        </w:rPr>
-        <w:t>Процесс оценки включает анализ политики безопасности, управление рисками, меры контроля и процессы, способствуя выявлению недостатков и определению приоритетов для улучшения. Стандарты подчеркивают важность интеграции измерений в повседневную деятельность организации с минимальным дополнительным использованием ресурсов. Важным аспектом является обеспечение воспроизводимости и сопоставимости результатов измерений, что помогает укрепить доверие заинтересованных сторон и обеспечивает прозрачность управления информационной безопасностью.</w:t>
-      </w:r>
-    </w:p>
-    <w:p>
-      <w:pPr>
-        <w:ind w:firstLine="709"/>
-        <w:jc w:val="both"/>
-        <w:rPr>
-          <w:rFonts w:ascii="Times New Roman" w:hAnsi="Times New Roman" w:cs="Times New Roman"/>
-          <w:sz w:val="28"/>
-          <w:szCs w:val="28"/>
-        </w:rPr>
-      </w:pPr>
-      <w:r>
-        <w:rPr>
-          <w:rFonts w:ascii="Times New Roman" w:hAnsi="Times New Roman" w:cs="Times New Roman"/>
-          <w:sz w:val="28"/>
-          <w:szCs w:val="28"/>
-        </w:rPr>
-        <w:t>Кроме того, документы предусматривают адаптацию программ измерений под специфические особенности организации — её размер, виды деятельности, применимые требования и риски. Накопленные результаты измерений служат основой для контроля прогресса в достижении целей безопасности и реализации процессов постоянного совершенствования. Такой подход способствует реализации требований ISO/IEC 27001 по регулярному мониторингу и улучшению СУИБ, подтверждая эффективность и надежность системы в долгосрочной перспективе.ISO/IEC 27004:2009 и ГОСТ Р ИСО/МЭК 27004–2011 — это стандарты, посвящённые оценке эффективности функционирования системы управления информационной безопасностью (СУИБ). Они предлагают рекомендации по разработке и применению измерений и показателей, которые помогают оценить, насколько реализованная система обеспечивает защиту информации в соответствии с требованиями ISO/IEC 27001. Оценка охватывает политику безопасности, управление рисками, меры контроля и процессы, позволяя выявлять неэффективные зоны и определять направления для улучшения.</w:t>
-      </w:r>
-    </w:p>
-    <w:p>
-      <w:pPr>
-        <w:ind w:firstLine="709"/>
-        <w:jc w:val="both"/>
-        <w:rPr>
-          <w:rFonts w:ascii="Times New Roman" w:hAnsi="Times New Roman" w:cs="Times New Roman"/>
-          <w:sz w:val="28"/>
-          <w:szCs w:val="28"/>
-        </w:rPr>
-      </w:pPr>
-    </w:p>
-    <w:p>
-      <w:pPr>
-        <w:ind w:firstLine="709"/>
-        <w:jc w:val="both"/>
-        <w:rPr>
-          <w:rFonts w:ascii="Times New Roman" w:hAnsi="Times New Roman" w:cs="Times New Roman"/>
-          <w:sz w:val="28"/>
-          <w:szCs w:val="28"/>
-        </w:rPr>
-      </w:pPr>
-      <w:r>
-        <w:rPr>
-          <w:rFonts w:ascii="Times New Roman" w:hAnsi="Times New Roman" w:cs="Times New Roman"/>
-          <w:sz w:val="28"/>
-          <w:szCs w:val="28"/>
-        </w:rPr>
-        <w:lastRenderedPageBreak/>
-        <w:t>Данные стандарты подчеркивают важность интеграции процедур измерения в регулярную деятельность организации с целью минимизации лишних затрат ресурсов и обеспечения воспроизводимости результатов. Они акцентируют внимание на необходимости адаптации программы измерений под особенности организации, учитывая размер, специфику деятельности и уровень рисков. Накопленные данные по результатам измерений позволяют контролировать прогресс в достижении целей и способствуют непрерывному совершенствованию СУИБ.</w:t>
-      </w:r>
-    </w:p>
-    <w:p>
-      <w:pPr>
-        <w:ind w:firstLine="709"/>
-        <w:jc w:val="both"/>
-        <w:rPr>
-          <w:rFonts w:ascii="Times New Roman" w:hAnsi="Times New Roman" w:cs="Times New Roman"/>
-          <w:sz w:val="28"/>
-          <w:szCs w:val="28"/>
-        </w:rPr>
-      </w:pPr>
-      <w:r>
-        <w:rPr>
-          <w:rFonts w:ascii="Times New Roman" w:hAnsi="Times New Roman" w:cs="Times New Roman"/>
-          <w:sz w:val="28"/>
-          <w:szCs w:val="28"/>
-        </w:rPr>
-        <w:t>Таким образом, применение ISO/IEC 27004 и ГОСТ Р ИСО/МЭК 27004 способствует укреплению доверия заинтересованных сторон и повышению прозрачности управления информационной безопасностью. Регулярная оценка эффективности системы помогает организациям своевременно реагировать на риски и поддерживать высокий уровень информационной безопасности в долгосрочной перспективе.</w:t>
-      </w:r>
-    </w:p>
-    <w:p>
-      <w:pPr>
-        <w:ind w:firstLine="709"/>
-        <w:jc w:val="both"/>
-        <w:rPr>
-          <w:rFonts w:ascii="Times New Roman" w:hAnsi="Times New Roman" w:cs="Times New Roman"/>
-          <w:sz w:val="28"/>
-          <w:szCs w:val="28"/>
-        </w:rPr>
-      </w:pPr>
-    </w:p>
-    <w:p>
-      <w:pPr>
-        <w:ind w:firstLine="709"/>
-        <w:jc w:val="both"/>
-        <w:rPr>
-          <w:rFonts w:ascii="Times New Roman" w:hAnsi="Times New Roman" w:cs="Times New Roman"/>
-          <w:sz w:val="28"/>
-          <w:szCs w:val="28"/>
-        </w:rPr>
-      </w:pPr>
+        <w:t>Практические примеры разных видов шифров включают шифр Цезаря (простейший подстановочный), шифр Виженера (полиграфический с ключом), AES (современный блочный симметричный шифр), RSA (асимметричный алгоритм на основе факторизации), а также потоковые шифры типа RC4 и новые алгоритмы ChaCha20. Классификация позволяет подобрать оптимальные решения для защиты данных в зависимости от конкретных требований — скорости, безопасности, удобства внедрения и специфики угроз, что критично в современных информационных системах.</w:t>
+      </w:r>
     </w:p>
     <w:p>
       <w:pPr>
@@ -1484,6 +844,95 @@
     </w:lvl>
   </w:abstractNum>
   <w:abstractNum w:abstractNumId="2" w15:restartNumberingAfterBreak="0">
+    <w:nsid w:val="29E15287"/>
+    <w:multiLevelType w:val="hybridMultilevel"/>
+    <w:tmpl w:val="405EE206"/>
+    <w:lvl w:ilvl="0" w:tplc="5E625FCA">
+      <w:start w:val="1"/>
+      <w:numFmt w:val="decimal"/>
+      <w:lvlText w:val="%1."/>
+      <w:lvlJc w:val="left"/>
+      <w:pPr>
+        <w:ind w:left="1294" w:hanging="585"/>
+      </w:pPr>
+      <w:rPr>
+        <w:rFonts w:hint="default"/>
+      </w:rPr>
+    </w:lvl>
+    <w:lvl w:ilvl="1" w:tplc="04190019" w:tentative="1">
+      <w:start w:val="1"/>
+      <w:numFmt w:val="lowerLetter"/>
+      <w:lvlText w:val="%2."/>
+      <w:lvlJc w:val="left"/>
+      <w:pPr>
+        <w:ind w:left="1789" w:hanging="360"/>
+      </w:pPr>
+    </w:lvl>
+    <w:lvl w:ilvl="2" w:tplc="0419001B" w:tentative="1">
+      <w:start w:val="1"/>
+      <w:numFmt w:val="lowerRoman"/>
+      <w:lvlText w:val="%3."/>
+      <w:lvlJc w:val="right"/>
+      <w:pPr>
+        <w:ind w:left="2509" w:hanging="180"/>
+      </w:pPr>
+    </w:lvl>
+    <w:lvl w:ilvl="3" w:tplc="0419000F" w:tentative="1">
+      <w:start w:val="1"/>
+      <w:numFmt w:val="decimal"/>
+      <w:lvlText w:val="%4."/>
+      <w:lvlJc w:val="left"/>
+      <w:pPr>
+        <w:ind w:left="3229" w:hanging="360"/>
+      </w:pPr>
+    </w:lvl>
+    <w:lvl w:ilvl="4" w:tplc="04190019" w:tentative="1">
+      <w:start w:val="1"/>
+      <w:numFmt w:val="lowerLetter"/>
+      <w:lvlText w:val="%5."/>
+      <w:lvlJc w:val="left"/>
+      <w:pPr>
+        <w:ind w:left="3949" w:hanging="360"/>
+      </w:pPr>
+    </w:lvl>
+    <w:lvl w:ilvl="5" w:tplc="0419001B" w:tentative="1">
+      <w:start w:val="1"/>
+      <w:numFmt w:val="lowerRoman"/>
+      <w:lvlText w:val="%6."/>
+      <w:lvlJc w:val="right"/>
+      <w:pPr>
+        <w:ind w:left="4669" w:hanging="180"/>
+      </w:pPr>
+    </w:lvl>
+    <w:lvl w:ilvl="6" w:tplc="0419000F" w:tentative="1">
+      <w:start w:val="1"/>
+      <w:numFmt w:val="decimal"/>
+      <w:lvlText w:val="%7."/>
+      <w:lvlJc w:val="left"/>
+      <w:pPr>
+        <w:ind w:left="5389" w:hanging="360"/>
+      </w:pPr>
+    </w:lvl>
+    <w:lvl w:ilvl="7" w:tplc="04190019" w:tentative="1">
+      <w:start w:val="1"/>
+      <w:numFmt w:val="lowerLetter"/>
+      <w:lvlText w:val="%8."/>
+      <w:lvlJc w:val="left"/>
+      <w:pPr>
+        <w:ind w:left="6109" w:hanging="360"/>
+      </w:pPr>
+    </w:lvl>
+    <w:lvl w:ilvl="8" w:tplc="0419001B" w:tentative="1">
+      <w:start w:val="1"/>
+      <w:numFmt w:val="lowerRoman"/>
+      <w:lvlText w:val="%9."/>
+      <w:lvlJc w:val="right"/>
+      <w:pPr>
+        <w:ind w:left="6829" w:hanging="180"/>
+      </w:pPr>
+    </w:lvl>
+  </w:abstractNum>
+  <w:abstractNum w:abstractNumId="3" w15:restartNumberingAfterBreak="0">
     <w:nsid w:val="2AE42F4F"/>
     <w:multiLevelType w:val="hybridMultilevel"/>
     <w:tmpl w:val="2778959C"/>
@@ -1596,7 +1045,7 @@
       </w:rPr>
     </w:lvl>
   </w:abstractNum>
-  <w:abstractNum w:abstractNumId="3" w15:restartNumberingAfterBreak="0">
+  <w:abstractNum w:abstractNumId="4" w15:restartNumberingAfterBreak="0">
     <w:nsid w:val="2BDE2A6B"/>
     <w:multiLevelType w:val="hybridMultilevel"/>
     <w:tmpl w:val="FF40D934"/>
@@ -1709,7 +1158,7 @@
       </w:rPr>
     </w:lvl>
   </w:abstractNum>
-  <w:abstractNum w:abstractNumId="4" w15:restartNumberingAfterBreak="0">
+  <w:abstractNum w:abstractNumId="5" w15:restartNumberingAfterBreak="0">
     <w:nsid w:val="59AE2115"/>
     <w:multiLevelType w:val="hybridMultilevel"/>
     <w:tmpl w:val="1DEC69D2"/>
@@ -1822,7 +1271,7 @@
       </w:rPr>
     </w:lvl>
   </w:abstractNum>
-  <w:abstractNum w:abstractNumId="5" w15:restartNumberingAfterBreak="0">
+  <w:abstractNum w:abstractNumId="6" w15:restartNumberingAfterBreak="0">
     <w:nsid w:val="62104AF9"/>
     <w:multiLevelType w:val="hybridMultilevel"/>
     <w:tmpl w:val="508EB4F6"/>
@@ -1911,7 +1360,7 @@
       </w:pPr>
     </w:lvl>
   </w:abstractNum>
-  <w:abstractNum w:abstractNumId="6" w15:restartNumberingAfterBreak="0">
+  <w:abstractNum w:abstractNumId="7" w15:restartNumberingAfterBreak="0">
     <w:nsid w:val="645E4658"/>
     <w:multiLevelType w:val="hybridMultilevel"/>
     <w:tmpl w:val="A6F6D958"/>
@@ -2000,7 +1449,7 @@
       </w:pPr>
     </w:lvl>
   </w:abstractNum>
-  <w:abstractNum w:abstractNumId="7" w15:restartNumberingAfterBreak="0">
+  <w:abstractNum w:abstractNumId="8" w15:restartNumberingAfterBreak="0">
     <w:nsid w:val="669B25B0"/>
     <w:multiLevelType w:val="hybridMultilevel"/>
     <w:tmpl w:val="1568B62E"/>
@@ -2113,7 +1562,7 @@
       </w:rPr>
     </w:lvl>
   </w:abstractNum>
-  <w:abstractNum w:abstractNumId="8" w15:restartNumberingAfterBreak="0">
+  <w:abstractNum w:abstractNumId="9" w15:restartNumberingAfterBreak="0">
     <w:nsid w:val="692615BB"/>
     <w:multiLevelType w:val="hybridMultilevel"/>
     <w:tmpl w:val="97C4E37C"/>
@@ -2226,7 +1675,7 @@
       </w:rPr>
     </w:lvl>
   </w:abstractNum>
-  <w:abstractNum w:abstractNumId="9" w15:restartNumberingAfterBreak="0">
+  <w:abstractNum w:abstractNumId="10" w15:restartNumberingAfterBreak="0">
     <w:nsid w:val="6F6B2FD5"/>
     <w:multiLevelType w:val="hybridMultilevel"/>
     <w:tmpl w:val="508EB4F6"/>
@@ -2315,7 +1764,7 @@
       </w:pPr>
     </w:lvl>
   </w:abstractNum>
-  <w:abstractNum w:abstractNumId="10" w15:restartNumberingAfterBreak="0">
+  <w:abstractNum w:abstractNumId="11" w15:restartNumberingAfterBreak="0">
     <w:nsid w:val="7050098D"/>
     <w:multiLevelType w:val="hybridMultilevel"/>
     <w:tmpl w:val="3B20A7B6"/>
@@ -2428,7 +1877,7 @@
       </w:rPr>
     </w:lvl>
   </w:abstractNum>
-  <w:abstractNum w:abstractNumId="11" w15:restartNumberingAfterBreak="0">
+  <w:abstractNum w:abstractNumId="12" w15:restartNumberingAfterBreak="0">
     <w:nsid w:val="734E395D"/>
     <w:multiLevelType w:val="hybridMultilevel"/>
     <w:tmpl w:val="CFE8AFEC"/>
@@ -2545,37 +1994,40 @@
     <w:abstractNumId w:val="1"/>
   </w:num>
   <w:num w:numId="2">
+    <w:abstractNumId w:val="7"/>
+  </w:num>
+  <w:num w:numId="3">
     <w:abstractNumId w:val="6"/>
   </w:num>
-  <w:num w:numId="3">
+  <w:num w:numId="4">
     <w:abstractNumId w:val="5"/>
   </w:num>
-  <w:num w:numId="4">
+  <w:num w:numId="5">
     <w:abstractNumId w:val="4"/>
   </w:num>
-  <w:num w:numId="5">
+  <w:num w:numId="6">
     <w:abstractNumId w:val="3"/>
   </w:num>
-  <w:num w:numId="6">
-    <w:abstractNumId w:val="2"/>
-  </w:num>
   <w:num w:numId="7">
-    <w:abstractNumId w:val="10"/>
+    <w:abstractNumId w:val="11"/>
   </w:num>
   <w:num w:numId="8">
     <w:abstractNumId w:val="0"/>
   </w:num>
   <w:num w:numId="9">
-    <w:abstractNumId w:val="11"/>
+    <w:abstractNumId w:val="12"/>
   </w:num>
   <w:num w:numId="10">
+    <w:abstractNumId w:val="9"/>
+  </w:num>
+  <w:num w:numId="11">
+    <w:abstractNumId w:val="10"/>
+  </w:num>
+  <w:num w:numId="12">
     <w:abstractNumId w:val="8"/>
   </w:num>
-  <w:num w:numId="11">
-    <w:abstractNumId w:val="9"/>
-  </w:num>
-  <w:num w:numId="12">
-    <w:abstractNumId w:val="7"/>
+  <w:num w:numId="13">
+    <w:abstractNumId w:val="2"/>
   </w:num>
 </w:numbering>
 </file>

</xml_diff>